<commit_message>
update post de ranger
</commit_message>
<xml_diff>
--- a/_site/operating-system/2025-12-30-guia-de-ranger/index.docx
+++ b/_site/operating-system/2025-12-30-guia-de-ranger/index.docx
@@ -202,7 +202,7 @@
         <w:pStyle w:val="AbstractFirstParagraph"/>
       </w:pPr>
       <w:r>
-        <w:t xml:space="preserve">Ranger es un gestor de archivos basado en consola altamente eficiente, diseñado con una fuerte inspiración en los atajos de teclado de Vim y una filosofía minimalista. Esta guía completa explora en detalle su instalación en diferentes sistemas operativos, configuración inicial y avanzada, estructura de archivos de configuración (rc.conf, rifle.conf, scope.sh, commands.py), así como la personalización profunda mediante mapeos de teclado, comandos personalizados en Python y plugins. Se detallan las características principales que lo distinguen; navegación multi-columna, previsualización automática de múltiples tipos de archivo (texto, código, imágenes, PDFs, videos, comprimidos), gestión inteligente de archivos mediante rifle, soporte de pestañas, marcadores, renombrado masivo, integración con el shell y capacidades de preview mejoradas mediante herramientas externas. La guía incluye referencias prácticas de atajos fundamentales y avanzados, ejemplos de configuración realistas, soluciones a problemas comunes, trucos de productividad y recomendaciones para integrar Ranger en flujos de trabajo diarios de usuarios de terminal (especialmente aquellos familiarizados con Vim/Neovim). Dirigida tanto a usuarios noveles que buscan reemplazar gestores gráficos tradicionales, como a usuarios avanzados que desean optimizar y extender al máximo esta poderosa herramienta de gestión de archivos en entornos Unix-like.</w:t>
+        <w:t xml:space="preserve">Ranger es un gestor de archivos basado en consola altamente eficiente, diseñado con una fuerte inspiración en los atajos de teclado de Vim y una filosofía minimalista. Esta guía completa explora en detalle su instalación en diferentes sistemas operativos, configuración inicial y avanzada, estructura de archivos de configuración (rc.conf, rifle.conf, scope.sh, commands.py), así como la personalización profunda mediante mapeos de teclado, comandos personalizados en Python y plugins. Se detallan las características principales que lo distinguen; navegación multi-columna, previsualización automática de múltiples tipos de archivo (texto, código, imágenes, PDFs, videos, comprimidos), gestión inteligente de archivos mediante rifle, soporte de pestañas, marcadores, renombrado masivo, integración con el shell y capacidades de preview mejoradas mediante herramientas externas. La guía incluye referencias prácticas de atajos fundamentales y avanzados, ejemplos de configuración realistas, soluciones a problemas comunes, trucos de productividad y recomendaciones para integrar Ranger en flujos de trabajo diarios de usuarios de terminal (especialmente aquellos familiarizados con Vim/Neovim). Dirigida tanto a usuarios noveles que buscan reemplazar gestores gráficos tradicionales, como a usuarios avanzados que desean optimizar y extender al máximo esta poderosa herramienta de gestión de archivos en entornos Linux.</w:t>
       </w:r>
     </w:p>
     <w:p>
@@ -253,48 +253,6 @@
       </w:pPr>
       <w:r>
         <w:t xml:space="preserve">Ranger es un gestor de archivos de consola con:</w:t>
-      </w:r>
-      <w:r>
-        <w:t xml:space="preserve"> </w:t>
-      </w:r>
-      <w:r>
-        <w:t xml:space="preserve">- Atajos de teclado inspirados en Vim</w:t>
-      </w:r>
-      <w:r>
-        <w:t xml:space="preserve"> </w:t>
-      </w:r>
-      <w:r>
-        <w:t xml:space="preserve">- Interfaz minimalista con curses</w:t>
-      </w:r>
-      <w:r>
-        <w:t xml:space="preserve"> </w:t>
-      </w:r>
-      <w:r>
-        <w:t xml:space="preserve">- Vista de jerarquía de directorios (multi-columna)</w:t>
-      </w:r>
-      <w:r>
-        <w:t xml:space="preserve"> </w:t>
-      </w:r>
-      <w:r>
-        <w:t xml:space="preserve">- Previsualización automática de archivos</w:t>
-      </w:r>
-      <w:r>
-        <w:t xml:space="preserve"> </w:t>
-      </w:r>
-      <w:r>
-        <w:t xml:space="preserve">- Integración con rifle (lanzador de archivos inteligente)</w:t>
-      </w:r>
-    </w:p>
-    <w:p>
-      <w:pPr>
-        <w:pStyle w:val="BodyText"/>
-      </w:pPr>
-      <w:r>
-        <w:rPr>
-          <w:b/>
-          <w:bCs/>
-        </w:rPr>
-        <w:t xml:space="preserve">Filosofía de Diseño</w:t>
       </w:r>
     </w:p>
     <w:p>
@@ -306,14 +264,7 @@
         </w:numPr>
       </w:pPr>
       <w:r>
-        <w:rPr>
-          <w:b/>
-          <w:bCs/>
-        </w:rPr>
-        <w:t xml:space="preserve">Mantenible</w:t>
-      </w:r>
-      <w:r>
-        <w:t xml:space="preserve">: Escrito en Python de alto nivel</w:t>
+        <w:t xml:space="preserve">Atajos de teclado inspirados en Vim</w:t>
       </w:r>
     </w:p>
     <w:p>
@@ -325,14 +276,7 @@
         </w:numPr>
       </w:pPr>
       <w:r>
-        <w:rPr>
-          <w:b/>
-          <w:bCs/>
-        </w:rPr>
-        <w:t xml:space="preserve">Rápido</w:t>
-      </w:r>
-      <w:r>
-        <w:t xml:space="preserve">: Cambiar directorios y navegar eficientemente</w:t>
+        <w:t xml:space="preserve">Interfaz minimalista con curses</w:t>
       </w:r>
     </w:p>
     <w:p>
@@ -344,14 +288,7 @@
         </w:numPr>
       </w:pPr>
       <w:r>
-        <w:rPr>
-          <w:b/>
-          <w:bCs/>
-        </w:rPr>
-        <w:t xml:space="preserve">Minimalista</w:t>
-      </w:r>
-      <w:r>
-        <w:t xml:space="preserve">: Pequeño pero útil, hace una cosa bien</w:t>
+        <w:t xml:space="preserve">Vista de jerarquía de directorios (multi-columna)</w:t>
       </w:r>
     </w:p>
     <w:p>
@@ -363,26 +300,31 @@
         </w:numPr>
       </w:pPr>
       <w:r>
+        <w:t xml:space="preserve">Previsualización automática de archivos</w:t>
+      </w:r>
+    </w:p>
+    <w:p>
+      <w:pPr>
+        <w:pStyle w:val="Compact"/>
+        <w:numPr>
+          <w:ilvl w:val="0"/>
+          <w:numId w:val="1001"/>
+        </w:numPr>
+      </w:pPr>
+      <w:r>
+        <w:t xml:space="preserve">Integración con rifle (lanzador de archivos inteligente)</w:t>
+      </w:r>
+    </w:p>
+    <w:p>
+      <w:pPr>
+        <w:pStyle w:val="FirstParagraph"/>
+      </w:pPr>
+      <w:r>
         <w:rPr>
           <w:b/>
           <w:bCs/>
         </w:rPr>
-        <w:t xml:space="preserve">Integrado</w:t>
-      </w:r>
-      <w:r>
-        <w:t xml:space="preserve">: Perfecta integración con el shell Unix</w:t>
-      </w:r>
-    </w:p>
-    <w:p>
-      <w:pPr>
-        <w:pStyle w:val="FirstParagraph"/>
-      </w:pPr>
-      <w:r>
-        <w:rPr>
-          <w:b/>
-          <w:bCs/>
-        </w:rPr>
-        <w:t xml:space="preserve">Características Principales</w:t>
+        <w:t xml:space="preserve">Filosofía de Diseño</w:t>
       </w:r>
     </w:p>
     <w:p>
@@ -394,10 +336,14 @@
         </w:numPr>
       </w:pPr>
       <w:r>
-        <w:t xml:space="preserve">Soporte UTF-8</w:t>
-      </w:r>
-      <w:r>
-        <w:br/>
+        <w:rPr>
+          <w:b/>
+          <w:bCs/>
+        </w:rPr>
+        <w:t xml:space="preserve">Mantenible</w:t>
+      </w:r>
+      <w:r>
+        <w:t xml:space="preserve">: Escrito en Python de alto nivel</w:t>
       </w:r>
     </w:p>
     <w:p>
@@ -409,10 +355,14 @@
         </w:numPr>
       </w:pPr>
       <w:r>
-        <w:t xml:space="preserve">Pantalla multi-columna</w:t>
-      </w:r>
-      <w:r>
-        <w:br/>
+        <w:rPr>
+          <w:b/>
+          <w:bCs/>
+        </w:rPr>
+        <w:t xml:space="preserve">Rápido</w:t>
+      </w:r>
+      <w:r>
+        <w:t xml:space="preserve">: Cambiar directorios y navegar eficientemente</w:t>
       </w:r>
     </w:p>
     <w:p>
@@ -424,10 +374,14 @@
         </w:numPr>
       </w:pPr>
       <w:r>
-        <w:t xml:space="preserve">Previsualización del archivo/directorio seleccionado</w:t>
-      </w:r>
-      <w:r>
-        <w:br/>
+        <w:rPr>
+          <w:b/>
+          <w:bCs/>
+        </w:rPr>
+        <w:t xml:space="preserve">Minimalista</w:t>
+      </w:r>
+      <w:r>
+        <w:t xml:space="preserve">: Pequeño pero útil, hace una cosa bien</w:t>
       </w:r>
     </w:p>
     <w:p>
@@ -439,145 +393,14 @@
         </w:numPr>
       </w:pPr>
       <w:r>
-        <w:t xml:space="preserve">Operaciones comunes con archivos (crear/chmod/copiar/eliminar)</w:t>
-      </w:r>
-      <w:r>
-        <w:br/>
-      </w:r>
-    </w:p>
-    <w:p>
-      <w:pPr>
-        <w:pStyle w:val="Compact"/>
-        <w:numPr>
-          <w:ilvl w:val="0"/>
-          <w:numId w:val="1002"/>
-        </w:numPr>
-      </w:pPr>
-      <w:r>
-        <w:t xml:space="preserve">Renombrado múltiple de archivos</w:t>
-      </w:r>
-      <w:r>
-        <w:br/>
-      </w:r>
-    </w:p>
-    <w:p>
-      <w:pPr>
-        <w:pStyle w:val="Compact"/>
-        <w:numPr>
-          <w:ilvl w:val="0"/>
-          <w:numId w:val="1002"/>
-        </w:numPr>
-      </w:pPr>
-      <w:r>
-        <w:t xml:space="preserve">Consola y atajos estilo VIM</w:t>
-      </w:r>
-      <w:r>
-        <w:br/>
-      </w:r>
-    </w:p>
-    <w:p>
-      <w:pPr>
-        <w:pStyle w:val="Compact"/>
-        <w:numPr>
-          <w:ilvl w:val="0"/>
-          <w:numId w:val="1002"/>
-        </w:numPr>
-      </w:pPr>
-      <w:r>
-        <w:t xml:space="preserve">Determina tipos de archivo automáticamente</w:t>
-      </w:r>
-      <w:r>
-        <w:br/>
-      </w:r>
-    </w:p>
-    <w:p>
-      <w:pPr>
-        <w:pStyle w:val="Compact"/>
-        <w:numPr>
-          <w:ilvl w:val="0"/>
-          <w:numId w:val="1002"/>
-        </w:numPr>
-      </w:pPr>
-      <w:r>
-        <w:t xml:space="preserve">Pestañas, marcadores, soporte de ratón</w:t>
-      </w:r>
-      <w:r>
-        <w:br/>
-      </w:r>
-    </w:p>
-    <w:p>
-      <w:pPr>
-        <w:pStyle w:val="Compact"/>
-        <w:numPr>
-          <w:ilvl w:val="0"/>
-          <w:numId w:val="1002"/>
-        </w:numPr>
-      </w:pPr>
-      <w:r>
-        <w:t xml:space="preserve">Cambia el directorio del shell al salir</w:t>
-      </w:r>
-    </w:p>
-    <w:bookmarkEnd w:id="26"/>
-    <w:bookmarkStart w:id="32" w:name="instalación"/>
-    <w:p>
-      <w:pPr>
-        <w:pStyle w:val="Heading1"/>
-      </w:pPr>
-      <w:r>
-        <w:t xml:space="preserve">1. Instalación</w:t>
-      </w:r>
-    </w:p>
-    <w:bookmarkStart w:id="27" w:name="desde-repositorios"/>
-    <w:p>
-      <w:pPr>
-        <w:pStyle w:val="Heading2"/>
-      </w:pPr>
-      <w:r>
-        <w:t xml:space="preserve">1.1 Desde Repositorios</w:t>
-      </w:r>
-    </w:p>
-    <w:p>
-      <w:pPr>
-        <w:pStyle w:val="FirstParagraph"/>
-      </w:pPr>
-      <w:r>
         <w:rPr>
           <w:b/>
           <w:bCs/>
         </w:rPr>
-        <w:t xml:space="preserve">Ubuntu/Debian:</w:t>
-      </w:r>
-    </w:p>
-    <w:p>
-      <w:pPr>
-        <w:pStyle w:val="SourceCode"/>
-      </w:pPr>
-      <w:r>
-        <w:rPr>
-          <w:rStyle w:val="FunctionTok"/>
-        </w:rPr>
-        <w:t xml:space="preserve">sudo</w:t>
-      </w:r>
-      <w:r>
-        <w:rPr>
-          <w:rStyle w:val="NormalTok"/>
-        </w:rPr>
-        <w:t xml:space="preserve"> apt-get update</w:t>
-      </w:r>
-      <w:r>
-        <w:br/>
-      </w:r>
-      <w:r>
-        <w:rPr>
-          <w:rStyle w:val="FunctionTok"/>
-        </w:rPr>
-        <w:t xml:space="preserve">sudo</w:t>
-      </w:r>
-      <w:r>
-        <w:rPr>
-          <w:rStyle w:val="NormalTok"/>
-        </w:rPr>
-        <w:t xml:space="preserve"> apt-get install ranger</w:t>
+        <w:t xml:space="preserve">Integrado</w:t>
+      </w:r>
+      <w:r>
+        <w:t xml:space="preserve">: Perfecta integración con el shell Unix</w:t>
       </w:r>
     </w:p>
     <w:p>
@@ -589,929 +412,7 @@
           <w:b/>
           <w:bCs/>
         </w:rPr>
-        <w:t xml:space="preserve">Fedora:</w:t>
-      </w:r>
-    </w:p>
-    <w:p>
-      <w:pPr>
-        <w:pStyle w:val="SourceCode"/>
-      </w:pPr>
-      <w:r>
-        <w:rPr>
-          <w:rStyle w:val="FunctionTok"/>
-        </w:rPr>
-        <w:t xml:space="preserve">sudo</w:t>
-      </w:r>
-      <w:r>
-        <w:rPr>
-          <w:rStyle w:val="NormalTok"/>
-        </w:rPr>
-        <w:t xml:space="preserve"> dnf install ranger</w:t>
-      </w:r>
-    </w:p>
-    <w:p>
-      <w:pPr>
-        <w:pStyle w:val="FirstParagraph"/>
-      </w:pPr>
-      <w:r>
-        <w:rPr>
-          <w:b/>
-          <w:bCs/>
-        </w:rPr>
-        <w:t xml:space="preserve">Arch Linux:</w:t>
-      </w:r>
-    </w:p>
-    <w:p>
-      <w:pPr>
-        <w:pStyle w:val="SourceCode"/>
-      </w:pPr>
-      <w:r>
-        <w:rPr>
-          <w:rStyle w:val="FunctionTok"/>
-        </w:rPr>
-        <w:t xml:space="preserve">sudo</w:t>
-      </w:r>
-      <w:r>
-        <w:rPr>
-          <w:rStyle w:val="NormalTok"/>
-        </w:rPr>
-        <w:t xml:space="preserve"> pacman </w:t>
-      </w:r>
-      <w:r>
-        <w:rPr>
-          <w:rStyle w:val="AttributeTok"/>
-        </w:rPr>
-        <w:t xml:space="preserve">-S</w:t>
-      </w:r>
-      <w:r>
-        <w:rPr>
-          <w:rStyle w:val="NormalTok"/>
-        </w:rPr>
-        <w:t xml:space="preserve"> ranger</w:t>
-      </w:r>
-    </w:p>
-    <w:p>
-      <w:pPr>
-        <w:pStyle w:val="FirstParagraph"/>
-      </w:pPr>
-      <w:r>
-        <w:rPr>
-          <w:b/>
-          <w:bCs/>
-        </w:rPr>
-        <w:t xml:space="preserve">macOS (Homebrew):</w:t>
-      </w:r>
-    </w:p>
-    <w:p>
-      <w:pPr>
-        <w:pStyle w:val="SourceCode"/>
-      </w:pPr>
-      <w:r>
-        <w:rPr>
-          <w:rStyle w:val="ExtensionTok"/>
-        </w:rPr>
-        <w:t xml:space="preserve">brew</w:t>
-      </w:r>
-      <w:r>
-        <w:rPr>
-          <w:rStyle w:val="NormalTok"/>
-        </w:rPr>
-        <w:t xml:space="preserve"> install ranger</w:t>
-      </w:r>
-    </w:p>
-    <w:bookmarkEnd w:id="27"/>
-    <w:bookmarkStart w:id="28" w:name="desde-pypi"/>
-    <w:p>
-      <w:pPr>
-        <w:pStyle w:val="Heading2"/>
-      </w:pPr>
-      <w:r>
-        <w:t xml:space="preserve">1.2 Desde PyPI</w:t>
-      </w:r>
-    </w:p>
-    <w:p>
-      <w:pPr>
-        <w:pStyle w:val="SourceCode"/>
-      </w:pPr>
-      <w:r>
-        <w:rPr>
-          <w:rStyle w:val="ExtensionTok"/>
-        </w:rPr>
-        <w:t xml:space="preserve">pip</w:t>
-      </w:r>
-      <w:r>
-        <w:rPr>
-          <w:rStyle w:val="NormalTok"/>
-        </w:rPr>
-        <w:t xml:space="preserve"> install ranger-fm</w:t>
-      </w:r>
-      <w:r>
-        <w:br/>
-      </w:r>
-      <w:r>
-        <w:rPr>
-          <w:rStyle w:val="CommentTok"/>
-        </w:rPr>
-        <w:t xml:space="preserve"># O mejor con pipx (entorno aislado)</w:t>
-      </w:r>
-      <w:r>
-        <w:br/>
-      </w:r>
-      <w:r>
-        <w:rPr>
-          <w:rStyle w:val="ExtensionTok"/>
-        </w:rPr>
-        <w:t xml:space="preserve">pipx</w:t>
-      </w:r>
-      <w:r>
-        <w:rPr>
-          <w:rStyle w:val="NormalTok"/>
-        </w:rPr>
-        <w:t xml:space="preserve"> install ranger-fm</w:t>
-      </w:r>
-    </w:p>
-    <w:bookmarkEnd w:id="28"/>
-    <w:bookmarkStart w:id="29" w:name="desde-código-fuente"/>
-    <w:p>
-      <w:pPr>
-        <w:pStyle w:val="Heading2"/>
-      </w:pPr>
-      <w:r>
-        <w:t xml:space="preserve">1.3 Desde Código Fuente</w:t>
-      </w:r>
-    </w:p>
-    <w:p>
-      <w:pPr>
-        <w:pStyle w:val="SourceCode"/>
-      </w:pPr>
-      <w:r>
-        <w:rPr>
-          <w:rStyle w:val="FunctionTok"/>
-        </w:rPr>
-        <w:t xml:space="preserve">git</w:t>
-      </w:r>
-      <w:r>
-        <w:rPr>
-          <w:rStyle w:val="NormalTok"/>
-        </w:rPr>
-        <w:t xml:space="preserve"> clone https://github.com/ranger/ranger.git</w:t>
-      </w:r>
-      <w:r>
-        <w:br/>
-      </w:r>
-      <w:r>
-        <w:rPr>
-          <w:rStyle w:val="BuiltInTok"/>
-        </w:rPr>
-        <w:t xml:space="preserve">cd</w:t>
-      </w:r>
-      <w:r>
-        <w:rPr>
-          <w:rStyle w:val="NormalTok"/>
-        </w:rPr>
-        <w:t xml:space="preserve"> ranger</w:t>
-      </w:r>
-      <w:r>
-        <w:br/>
-      </w:r>
-      <w:r>
-        <w:rPr>
-          <w:rStyle w:val="FunctionTok"/>
-        </w:rPr>
-        <w:t xml:space="preserve">sudo</w:t>
-      </w:r>
-      <w:r>
-        <w:rPr>
-          <w:rStyle w:val="NormalTok"/>
-        </w:rPr>
-        <w:t xml:space="preserve"> make install</w:t>
-      </w:r>
-    </w:p>
-    <w:bookmarkEnd w:id="29"/>
-    <w:bookmarkStart w:id="30" w:name="verificar-instalación"/>
-    <w:p>
-      <w:pPr>
-        <w:pStyle w:val="Heading2"/>
-      </w:pPr>
-      <w:r>
-        <w:t xml:space="preserve">1.4 Verificar Instalación</w:t>
-      </w:r>
-    </w:p>
-    <w:p>
-      <w:pPr>
-        <w:pStyle w:val="SourceCode"/>
-      </w:pPr>
-      <w:r>
-        <w:rPr>
-          <w:rStyle w:val="ExtensionTok"/>
-        </w:rPr>
-        <w:t xml:space="preserve">ranger</w:t>
-      </w:r>
-      <w:r>
-        <w:rPr>
-          <w:rStyle w:val="NormalTok"/>
-        </w:rPr>
-        <w:t xml:space="preserve"> </w:t>
-      </w:r>
-      <w:r>
-        <w:rPr>
-          <w:rStyle w:val="AttributeTok"/>
-        </w:rPr>
-        <w:t xml:space="preserve">--version</w:t>
-      </w:r>
-    </w:p>
-    <w:bookmarkEnd w:id="30"/>
-    <w:bookmarkStart w:id="31" w:name="dependencias-opcionales"/>
-    <w:p>
-      <w:pPr>
-        <w:pStyle w:val="Heading2"/>
-      </w:pPr>
-      <w:r>
-        <w:t xml:space="preserve">1.5 Dependencias Opcionales</w:t>
-      </w:r>
-    </w:p>
-    <w:p>
-      <w:pPr>
-        <w:pStyle w:val="FirstParagraph"/>
-      </w:pPr>
-      <w:r>
-        <w:rPr>
-          <w:b/>
-          <w:bCs/>
-        </w:rPr>
-        <w:t xml:space="preserve">Para funcionalidad completa:</w:t>
-      </w:r>
-    </w:p>
-    <w:p>
-      <w:pPr>
-        <w:pStyle w:val="SourceCode"/>
-      </w:pPr>
-      <w:r>
-        <w:rPr>
-          <w:rStyle w:val="CommentTok"/>
-        </w:rPr>
-        <w:t xml:space="preserve"># Determinar tipos de archivo</w:t>
-      </w:r>
-      <w:r>
-        <w:br/>
-      </w:r>
-      <w:r>
-        <w:rPr>
-          <w:rStyle w:val="FunctionTok"/>
-        </w:rPr>
-        <w:t xml:space="preserve">sudo</w:t>
-      </w:r>
-      <w:r>
-        <w:rPr>
-          <w:rStyle w:val="NormalTok"/>
-        </w:rPr>
-        <w:t xml:space="preserve"> apt-get install file</w:t>
-      </w:r>
-      <w:r>
-        <w:br/>
-      </w:r>
-      <w:r>
-        <w:br/>
-      </w:r>
-      <w:r>
-        <w:rPr>
-          <w:rStyle w:val="CommentTok"/>
-        </w:rPr>
-        <w:t xml:space="preserve"># Detección mejorada de codificación</w:t>
-      </w:r>
-      <w:r>
-        <w:br/>
-      </w:r>
-      <w:r>
-        <w:rPr>
-          <w:rStyle w:val="ExtensionTok"/>
-        </w:rPr>
-        <w:t xml:space="preserve">pip</w:t>
-      </w:r>
-      <w:r>
-        <w:rPr>
-          <w:rStyle w:val="NormalTok"/>
-        </w:rPr>
-        <w:t xml:space="preserve"> install chardet</w:t>
-      </w:r>
-      <w:r>
-        <w:br/>
-      </w:r>
-      <w:r>
-        <w:br/>
-      </w:r>
-      <w:r>
-        <w:rPr>
-          <w:rStyle w:val="CommentTok"/>
-        </w:rPr>
-        <w:t xml:space="preserve"># Nombres bidireccionales (árabe, hebreo)</w:t>
-      </w:r>
-      <w:r>
-        <w:br/>
-      </w:r>
-      <w:r>
-        <w:rPr>
-          <w:rStyle w:val="ExtensionTok"/>
-        </w:rPr>
-        <w:t xml:space="preserve">pip</w:t>
-      </w:r>
-      <w:r>
-        <w:rPr>
-          <w:rStyle w:val="NormalTok"/>
-        </w:rPr>
-        <w:t xml:space="preserve"> install python-bidi</w:t>
-      </w:r>
-      <w:r>
-        <w:br/>
-      </w:r>
-      <w:r>
-        <w:br/>
-      </w:r>
-      <w:r>
-        <w:rPr>
-          <w:rStyle w:val="CommentTok"/>
-        </w:rPr>
-        <w:t xml:space="preserve"># Previsualización de imágenes</w:t>
-      </w:r>
-      <w:r>
-        <w:br/>
-      </w:r>
-      <w:r>
-        <w:rPr>
-          <w:rStyle w:val="FunctionTok"/>
-        </w:rPr>
-        <w:t xml:space="preserve">sudo</w:t>
-      </w:r>
-      <w:r>
-        <w:rPr>
-          <w:rStyle w:val="NormalTok"/>
-        </w:rPr>
-        <w:t xml:space="preserve"> apt-get install caca-utils w3m-img</w:t>
-      </w:r>
-      <w:r>
-        <w:br/>
-      </w:r>
-      <w:r>
-        <w:br/>
-      </w:r>
-      <w:r>
-        <w:rPr>
-          <w:rStyle w:val="CommentTok"/>
-        </w:rPr>
-        <w:t xml:space="preserve"># Conversión de imágenes</w:t>
-      </w:r>
-      <w:r>
-        <w:br/>
-      </w:r>
-      <w:r>
-        <w:rPr>
-          <w:rStyle w:val="FunctionTok"/>
-        </w:rPr>
-        <w:t xml:space="preserve">sudo</w:t>
-      </w:r>
-      <w:r>
-        <w:rPr>
-          <w:rStyle w:val="NormalTok"/>
-        </w:rPr>
-        <w:t xml:space="preserve"> apt-get install imagemagick</w:t>
-      </w:r>
-      <w:r>
-        <w:br/>
-      </w:r>
-      <w:r>
-        <w:br/>
-      </w:r>
-      <w:r>
-        <w:rPr>
-          <w:rStyle w:val="CommentTok"/>
-        </w:rPr>
-        <w:t xml:space="preserve"># Resaltado de sintaxis</w:t>
-      </w:r>
-      <w:r>
-        <w:br/>
-      </w:r>
-      <w:r>
-        <w:rPr>
-          <w:rStyle w:val="FunctionTok"/>
-        </w:rPr>
-        <w:t xml:space="preserve">sudo</w:t>
-      </w:r>
-      <w:r>
-        <w:rPr>
-          <w:rStyle w:val="NormalTok"/>
-        </w:rPr>
-        <w:t xml:space="preserve"> apt-get install highlight</w:t>
-      </w:r>
-      <w:r>
-        <w:br/>
-      </w:r>
-      <w:r>
-        <w:rPr>
-          <w:rStyle w:val="CommentTok"/>
-        </w:rPr>
-        <w:t xml:space="preserve"># O</w:t>
-      </w:r>
-      <w:r>
-        <w:br/>
-      </w:r>
-      <w:r>
-        <w:rPr>
-          <w:rStyle w:val="ExtensionTok"/>
-        </w:rPr>
-        <w:t xml:space="preserve">pip</w:t>
-      </w:r>
-      <w:r>
-        <w:rPr>
-          <w:rStyle w:val="NormalTok"/>
-        </w:rPr>
-        <w:t xml:space="preserve"> install pygments</w:t>
-      </w:r>
-      <w:r>
-        <w:br/>
-      </w:r>
-      <w:r>
-        <w:br/>
-      </w:r>
-      <w:r>
-        <w:rPr>
-          <w:rStyle w:val="CommentTok"/>
-        </w:rPr>
-        <w:t xml:space="preserve"># Previsualización de archivos comprimidos</w:t>
-      </w:r>
-      <w:r>
-        <w:br/>
-      </w:r>
-      <w:r>
-        <w:rPr>
-          <w:rStyle w:val="FunctionTok"/>
-        </w:rPr>
-        <w:t xml:space="preserve">sudo</w:t>
-      </w:r>
-      <w:r>
-        <w:rPr>
-          <w:rStyle w:val="NormalTok"/>
-        </w:rPr>
-        <w:t xml:space="preserve"> apt-get install atool unrar p7zip-full</w:t>
-      </w:r>
-      <w:r>
-        <w:br/>
-      </w:r>
-      <w:r>
-        <w:br/>
-      </w:r>
-      <w:r>
-        <w:rPr>
-          <w:rStyle w:val="CommentTok"/>
-        </w:rPr>
-        <w:t xml:space="preserve"># Previsualización de PDFs</w:t>
-      </w:r>
-      <w:r>
-        <w:br/>
-      </w:r>
-      <w:r>
-        <w:rPr>
-          <w:rStyle w:val="FunctionTok"/>
-        </w:rPr>
-        <w:t xml:space="preserve">sudo</w:t>
-      </w:r>
-      <w:r>
-        <w:rPr>
-          <w:rStyle w:val="NormalTok"/>
-        </w:rPr>
-        <w:t xml:space="preserve"> apt-get install poppler-utils</w:t>
-      </w:r>
-      <w:r>
-        <w:br/>
-      </w:r>
-      <w:r>
-        <w:br/>
-      </w:r>
-      <w:r>
-        <w:rPr>
-          <w:rStyle w:val="CommentTok"/>
-        </w:rPr>
-        <w:t xml:space="preserve"># Previsualización de videos</w:t>
-      </w:r>
-      <w:r>
-        <w:br/>
-      </w:r>
-      <w:r>
-        <w:rPr>
-          <w:rStyle w:val="FunctionTok"/>
-        </w:rPr>
-        <w:t xml:space="preserve">sudo</w:t>
-      </w:r>
-      <w:r>
-        <w:rPr>
-          <w:rStyle w:val="NormalTok"/>
-        </w:rPr>
-        <w:t xml:space="preserve"> apt-get install ffmpegthumbnailer</w:t>
-      </w:r>
-      <w:r>
-        <w:br/>
-      </w:r>
-      <w:r>
-        <w:br/>
-      </w:r>
-      <w:r>
-        <w:rPr>
-          <w:rStyle w:val="CommentTok"/>
-        </w:rPr>
-        <w:t xml:space="preserve"># Información de medios</w:t>
-      </w:r>
-      <w:r>
-        <w:br/>
-      </w:r>
-      <w:r>
-        <w:rPr>
-          <w:rStyle w:val="FunctionTok"/>
-        </w:rPr>
-        <w:t xml:space="preserve">sudo</w:t>
-      </w:r>
-      <w:r>
-        <w:rPr>
-          <w:rStyle w:val="NormalTok"/>
-        </w:rPr>
-        <w:t xml:space="preserve"> apt-get install mediainfo</w:t>
-      </w:r>
-      <w:r>
-        <w:br/>
-      </w:r>
-      <w:r>
-        <w:br/>
-      </w:r>
-      <w:r>
-        <w:rPr>
-          <w:rStyle w:val="CommentTok"/>
-        </w:rPr>
-        <w:t xml:space="preserve"># Convertir SVG</w:t>
-      </w:r>
-      <w:r>
-        <w:br/>
-      </w:r>
-      <w:r>
-        <w:rPr>
-          <w:rStyle w:val="FunctionTok"/>
-        </w:rPr>
-        <w:t xml:space="preserve">sudo</w:t>
-      </w:r>
-      <w:r>
-        <w:rPr>
-          <w:rStyle w:val="NormalTok"/>
-        </w:rPr>
-        <w:t xml:space="preserve"> apt-get install librsvg2-bin</w:t>
-      </w:r>
-    </w:p>
-    <w:bookmarkEnd w:id="31"/>
-    <w:bookmarkEnd w:id="32"/>
-    <w:bookmarkStart w:id="36" w:name="configuración-inicial"/>
-    <w:p>
-      <w:pPr>
-        <w:pStyle w:val="Heading1"/>
-      </w:pPr>
-      <w:r>
-        <w:t xml:space="preserve">2. Configuración Inicial</w:t>
-      </w:r>
-    </w:p>
-    <w:bookmarkStart w:id="33" w:name="generar-archivos-de-configuración"/>
-    <w:p>
-      <w:pPr>
-        <w:pStyle w:val="Heading2"/>
-      </w:pPr>
-      <w:r>
-        <w:t xml:space="preserve">2.1 Generar Archivos de Configuración</w:t>
-      </w:r>
-    </w:p>
-    <w:p>
-      <w:pPr>
-        <w:pStyle w:val="FirstParagraph"/>
-      </w:pPr>
-      <w:r>
-        <w:t xml:space="preserve">Ranger puede copiar automáticamente los archivos de configuración por defecto:</w:t>
-      </w:r>
-    </w:p>
-    <w:p>
-      <w:pPr>
-        <w:pStyle w:val="SourceCode"/>
-      </w:pPr>
-      <w:r>
-        <w:rPr>
-          <w:rStyle w:val="CommentTok"/>
-        </w:rPr>
-        <w:t xml:space="preserve"># Copiar todas las configuraciones</w:t>
-      </w:r>
-      <w:r>
-        <w:br/>
-      </w:r>
-      <w:r>
-        <w:rPr>
-          <w:rStyle w:val="ExtensionTok"/>
-        </w:rPr>
-        <w:t xml:space="preserve">ranger</w:t>
-      </w:r>
-      <w:r>
-        <w:rPr>
-          <w:rStyle w:val="NormalTok"/>
-        </w:rPr>
-        <w:t xml:space="preserve"> </w:t>
-      </w:r>
-      <w:r>
-        <w:rPr>
-          <w:rStyle w:val="AttributeTok"/>
-        </w:rPr>
-        <w:t xml:space="preserve">--copy-config</w:t>
-      </w:r>
-      <w:r>
-        <w:rPr>
-          <w:rStyle w:val="OperatorTok"/>
-        </w:rPr>
-        <w:t xml:space="preserve">=</w:t>
-      </w:r>
-      <w:r>
-        <w:rPr>
-          <w:rStyle w:val="NormalTok"/>
-        </w:rPr>
-        <w:t xml:space="preserve">all</w:t>
-      </w:r>
-      <w:r>
-        <w:br/>
-      </w:r>
-      <w:r>
-        <w:br/>
-      </w:r>
-      <w:r>
-        <w:rPr>
-          <w:rStyle w:val="CommentTok"/>
-        </w:rPr>
-        <w:t xml:space="preserve"># Copiar archivos específicos</w:t>
-      </w:r>
-      <w:r>
-        <w:br/>
-      </w:r>
-      <w:r>
-        <w:rPr>
-          <w:rStyle w:val="ExtensionTok"/>
-        </w:rPr>
-        <w:t xml:space="preserve">ranger</w:t>
-      </w:r>
-      <w:r>
-        <w:rPr>
-          <w:rStyle w:val="NormalTok"/>
-        </w:rPr>
-        <w:t xml:space="preserve"> </w:t>
-      </w:r>
-      <w:r>
-        <w:rPr>
-          <w:rStyle w:val="AttributeTok"/>
-        </w:rPr>
-        <w:t xml:space="preserve">--copy-config</w:t>
-      </w:r>
-      <w:r>
-        <w:rPr>
-          <w:rStyle w:val="OperatorTok"/>
-        </w:rPr>
-        <w:t xml:space="preserve">=</w:t>
-      </w:r>
-      <w:r>
-        <w:rPr>
-          <w:rStyle w:val="NormalTok"/>
-        </w:rPr>
-        <w:t xml:space="preserve">rc          </w:t>
-      </w:r>
-      <w:r>
-        <w:rPr>
-          <w:rStyle w:val="CommentTok"/>
-        </w:rPr>
-        <w:t xml:space="preserve"># Configuración principal</w:t>
-      </w:r>
-      <w:r>
-        <w:br/>
-      </w:r>
-      <w:r>
-        <w:rPr>
-          <w:rStyle w:val="ExtensionTok"/>
-        </w:rPr>
-        <w:t xml:space="preserve">ranger</w:t>
-      </w:r>
-      <w:r>
-        <w:rPr>
-          <w:rStyle w:val="NormalTok"/>
-        </w:rPr>
-        <w:t xml:space="preserve"> </w:t>
-      </w:r>
-      <w:r>
-        <w:rPr>
-          <w:rStyle w:val="AttributeTok"/>
-        </w:rPr>
-        <w:t xml:space="preserve">--copy-config</w:t>
-      </w:r>
-      <w:r>
-        <w:rPr>
-          <w:rStyle w:val="OperatorTok"/>
-        </w:rPr>
-        <w:t xml:space="preserve">=</w:t>
-      </w:r>
-      <w:r>
-        <w:rPr>
-          <w:rStyle w:val="NormalTok"/>
-        </w:rPr>
-        <w:t xml:space="preserve">rifle       </w:t>
-      </w:r>
-      <w:r>
-        <w:rPr>
-          <w:rStyle w:val="CommentTok"/>
-        </w:rPr>
-        <w:t xml:space="preserve"># Configuración de rifle</w:t>
-      </w:r>
-      <w:r>
-        <w:br/>
-      </w:r>
-      <w:r>
-        <w:rPr>
-          <w:rStyle w:val="ExtensionTok"/>
-        </w:rPr>
-        <w:t xml:space="preserve">ranger</w:t>
-      </w:r>
-      <w:r>
-        <w:rPr>
-          <w:rStyle w:val="NormalTok"/>
-        </w:rPr>
-        <w:t xml:space="preserve"> </w:t>
-      </w:r>
-      <w:r>
-        <w:rPr>
-          <w:rStyle w:val="AttributeTok"/>
-        </w:rPr>
-        <w:t xml:space="preserve">--copy-config</w:t>
-      </w:r>
-      <w:r>
-        <w:rPr>
-          <w:rStyle w:val="OperatorTok"/>
-        </w:rPr>
-        <w:t xml:space="preserve">=</w:t>
-      </w:r>
-      <w:r>
-        <w:rPr>
-          <w:rStyle w:val="NormalTok"/>
-        </w:rPr>
-        <w:t xml:space="preserve">scope       </w:t>
-      </w:r>
-      <w:r>
-        <w:rPr>
-          <w:rStyle w:val="CommentTok"/>
-        </w:rPr>
-        <w:t xml:space="preserve"># Script de previsualización</w:t>
-      </w:r>
-      <w:r>
-        <w:br/>
-      </w:r>
-      <w:r>
-        <w:rPr>
-          <w:rStyle w:val="ExtensionTok"/>
-        </w:rPr>
-        <w:t xml:space="preserve">ranger</w:t>
-      </w:r>
-      <w:r>
-        <w:rPr>
-          <w:rStyle w:val="NormalTok"/>
-        </w:rPr>
-        <w:t xml:space="preserve"> </w:t>
-      </w:r>
-      <w:r>
-        <w:rPr>
-          <w:rStyle w:val="AttributeTok"/>
-        </w:rPr>
-        <w:t xml:space="preserve">--copy-config</w:t>
-      </w:r>
-      <w:r>
-        <w:rPr>
-          <w:rStyle w:val="OperatorTok"/>
-        </w:rPr>
-        <w:t xml:space="preserve">=</w:t>
-      </w:r>
-      <w:r>
-        <w:rPr>
-          <w:rStyle w:val="NormalTok"/>
-        </w:rPr>
-        <w:t xml:space="preserve">commands    </w:t>
-      </w:r>
-      <w:r>
-        <w:rPr>
-          <w:rStyle w:val="CommentTok"/>
-        </w:rPr>
-        <w:t xml:space="preserve"># Comandos personalizados</w:t>
-      </w:r>
-    </w:p>
-    <w:bookmarkEnd w:id="33"/>
-    <w:bookmarkStart w:id="34" w:name="ubicación-de-archivos"/>
-    <w:p>
-      <w:pPr>
-        <w:pStyle w:val="Heading2"/>
-      </w:pPr>
-      <w:r>
-        <w:t xml:space="preserve">2.2 Ubicación de Archivos</w:t>
-      </w:r>
-    </w:p>
-    <w:p>
-      <w:pPr>
-        <w:pStyle w:val="FirstParagraph"/>
-      </w:pPr>
-      <w:r>
-        <w:t xml:space="preserve">Los archivos de configuración se encuentran en:</w:t>
-      </w:r>
-    </w:p>
-    <w:p>
-      <w:pPr>
-        <w:pStyle w:val="SourceCode"/>
-      </w:pPr>
-      <w:r>
-        <w:rPr>
-          <w:rStyle w:val="VerbatimChar"/>
-        </w:rPr>
-        <w:t xml:space="preserve">~/.config/ranger/</w:t>
-      </w:r>
-      <w:r>
-        <w:br/>
-      </w:r>
-      <w:r>
-        <w:rPr>
-          <w:rStyle w:val="VerbatimChar"/>
-        </w:rPr>
-        <w:t xml:space="preserve">├── rc.conf           # Configuración principal y atajos</w:t>
-      </w:r>
-      <w:r>
-        <w:br/>
-      </w:r>
-      <w:r>
-        <w:rPr>
-          <w:rStyle w:val="VerbatimChar"/>
-        </w:rPr>
-        <w:t xml:space="preserve">├── rifle.conf        # Lanzador de archivos</w:t>
-      </w:r>
-      <w:r>
-        <w:br/>
-      </w:r>
-      <w:r>
-        <w:rPr>
-          <w:rStyle w:val="VerbatimChar"/>
-        </w:rPr>
-        <w:t xml:space="preserve">├── scope.sh          # Script de previsualización</w:t>
-      </w:r>
-      <w:r>
-        <w:br/>
-      </w:r>
-      <w:r>
-        <w:rPr>
-          <w:rStyle w:val="VerbatimChar"/>
-        </w:rPr>
-        <w:t xml:space="preserve">├── commands.py       # Comandos personalizados (Python)</w:t>
-      </w:r>
-      <w:r>
-        <w:br/>
-      </w:r>
-      <w:r>
-        <w:rPr>
-          <w:rStyle w:val="VerbatimChar"/>
-        </w:rPr>
-        <w:t xml:space="preserve">├── commands_full.py  # Comandos adicionales</w:t>
-      </w:r>
-      <w:r>
-        <w:br/>
-      </w:r>
-      <w:r>
-        <w:rPr>
-          <w:rStyle w:val="VerbatimChar"/>
-        </w:rPr>
-        <w:t xml:space="preserve">└── plugins/          # Directorio para plugins</w:t>
-      </w:r>
-    </w:p>
-    <w:bookmarkEnd w:id="34"/>
-    <w:bookmarkStart w:id="35" w:name="primer-lanzamiento"/>
-    <w:p>
-      <w:pPr>
-        <w:pStyle w:val="Heading2"/>
-      </w:pPr>
-      <w:r>
-        <w:t xml:space="preserve">2.3 Primer Lanzamiento</w:t>
-      </w:r>
-    </w:p>
-    <w:p>
-      <w:pPr>
-        <w:pStyle w:val="SourceCode"/>
-      </w:pPr>
-      <w:r>
-        <w:rPr>
-          <w:rStyle w:val="ExtensionTok"/>
-        </w:rPr>
-        <w:t xml:space="preserve">ranger</w:t>
-      </w:r>
-    </w:p>
-    <w:p>
-      <w:pPr>
-        <w:pStyle w:val="FirstParagraph"/>
-      </w:pPr>
-      <w:r>
-        <w:t xml:space="preserve">Al iniciar ranger por primera vez:</w:t>
+        <w:t xml:space="preserve">Características Principales</w:t>
       </w:r>
     </w:p>
     <w:p>
@@ -1523,7 +424,10 @@
         </w:numPr>
       </w:pPr>
       <w:r>
-        <w:t xml:space="preserve">Se abre en el directorio actual</w:t>
+        <w:t xml:space="preserve">Soporte UTF-8</w:t>
+      </w:r>
+      <w:r>
+        <w:br/>
       </w:r>
     </w:p>
     <w:p>
@@ -1535,7 +439,10 @@
         </w:numPr>
       </w:pPr>
       <w:r>
-        <w:t xml:space="preserve">Muestra tres columnas: padre, actual, previsualización</w:t>
+        <w:t xml:space="preserve">Pantalla multi-columna</w:t>
+      </w:r>
+      <w:r>
+        <w:br/>
       </w:r>
     </w:p>
     <w:p>
@@ -1547,27 +454,128 @@
         </w:numPr>
       </w:pPr>
       <w:r>
-        <w:t xml:space="preserve">Usa las flechas o hjkl para navegar</w:t>
-      </w:r>
-    </w:p>
-    <w:bookmarkEnd w:id="35"/>
-    <w:bookmarkEnd w:id="36"/>
-    <w:bookmarkStart w:id="40" w:name="interfaz-y-navegación-básica"/>
+        <w:t xml:space="preserve">Previsualización del archivo/directorio seleccionado</w:t>
+      </w:r>
+      <w:r>
+        <w:br/>
+      </w:r>
+    </w:p>
+    <w:p>
+      <w:pPr>
+        <w:pStyle w:val="Compact"/>
+        <w:numPr>
+          <w:ilvl w:val="0"/>
+          <w:numId w:val="1003"/>
+        </w:numPr>
+      </w:pPr>
+      <w:r>
+        <w:t xml:space="preserve">Operaciones comunes con archivos (crear/chmod/copiar/eliminar)</w:t>
+      </w:r>
+      <w:r>
+        <w:br/>
+      </w:r>
+    </w:p>
+    <w:p>
+      <w:pPr>
+        <w:pStyle w:val="Compact"/>
+        <w:numPr>
+          <w:ilvl w:val="0"/>
+          <w:numId w:val="1003"/>
+        </w:numPr>
+      </w:pPr>
+      <w:r>
+        <w:t xml:space="preserve">Renombrado múltiple de archivos</w:t>
+      </w:r>
+      <w:r>
+        <w:br/>
+      </w:r>
+    </w:p>
+    <w:p>
+      <w:pPr>
+        <w:pStyle w:val="Compact"/>
+        <w:numPr>
+          <w:ilvl w:val="0"/>
+          <w:numId w:val="1003"/>
+        </w:numPr>
+      </w:pPr>
+      <w:r>
+        <w:t xml:space="preserve">Consola y atajos estilo VIM</w:t>
+      </w:r>
+      <w:r>
+        <w:br/>
+      </w:r>
+    </w:p>
+    <w:p>
+      <w:pPr>
+        <w:pStyle w:val="Compact"/>
+        <w:numPr>
+          <w:ilvl w:val="0"/>
+          <w:numId w:val="1003"/>
+        </w:numPr>
+      </w:pPr>
+      <w:r>
+        <w:t xml:space="preserve">Determina tipos de archivo automáticamente</w:t>
+      </w:r>
+      <w:r>
+        <w:br/>
+      </w:r>
+    </w:p>
+    <w:p>
+      <w:pPr>
+        <w:pStyle w:val="Compact"/>
+        <w:numPr>
+          <w:ilvl w:val="0"/>
+          <w:numId w:val="1003"/>
+        </w:numPr>
+      </w:pPr>
+      <w:r>
+        <w:t xml:space="preserve">Pestañas, marcadores, soporte de ratón</w:t>
+      </w:r>
+      <w:r>
+        <w:br/>
+      </w:r>
+    </w:p>
+    <w:p>
+      <w:pPr>
+        <w:pStyle w:val="Compact"/>
+        <w:numPr>
+          <w:ilvl w:val="0"/>
+          <w:numId w:val="1003"/>
+        </w:numPr>
+      </w:pPr>
+      <w:r>
+        <w:t xml:space="preserve">Cambia el directorio del shell al salir</w:t>
+      </w:r>
+    </w:p>
+    <w:bookmarkEnd w:id="26"/>
+    <w:bookmarkStart w:id="32" w:name="instalación"/>
     <w:p>
       <w:pPr>
         <w:pStyle w:val="Heading1"/>
       </w:pPr>
       <w:r>
-        <w:t xml:space="preserve">3. Interfaz y Navegación Básica</w:t>
-      </w:r>
-    </w:p>
-    <w:bookmarkStart w:id="37" w:name="estructura-de-la-pantalla"/>
+        <w:t xml:space="preserve">1. Instalación</w:t>
+      </w:r>
+    </w:p>
+    <w:bookmarkStart w:id="27" w:name="desde-repositorios"/>
     <w:p>
       <w:pPr>
         <w:pStyle w:val="Heading2"/>
       </w:pPr>
       <w:r>
-        <w:t xml:space="preserve">3.1 Estructura de la Pantalla</w:t>
+        <w:t xml:space="preserve">1.1 Desde Repositorios</w:t>
+      </w:r>
+    </w:p>
+    <w:p>
+      <w:pPr>
+        <w:pStyle w:val="FirstParagraph"/>
+      </w:pPr>
+      <w:r>
+        <w:rPr>
+          <w:b/>
+          <w:bCs/>
+        </w:rPr>
+        <w:t xml:space="preserve">Ubuntu/Debian:</w:t>
       </w:r>
     </w:p>
     <w:p>
@@ -1576,109 +584,1036 @@
       </w:pPr>
       <w:r>
         <w:rPr>
-          <w:rStyle w:val="VerbatimChar"/>
-        </w:rPr>
-        <w:t xml:space="preserve">┌─────────────────────────────────────────────────────────┐</w:t>
-      </w:r>
-      <w:r>
-        <w:br/>
-      </w:r>
-      <w:r>
-        <w:rPr>
-          <w:rStyle w:val="VerbatimChar"/>
-        </w:rPr>
-        <w:t xml:space="preserve">│ Directorio Padre │ Directorio Actual │ Previsualización │</w:t>
-      </w:r>
-      <w:r>
-        <w:br/>
-      </w:r>
-      <w:r>
-        <w:rPr>
-          <w:rStyle w:val="VerbatimChar"/>
-        </w:rPr>
-        <w:t xml:space="preserve">│                  │                   │                  │</w:t>
-      </w:r>
-      <w:r>
-        <w:br/>
-      </w:r>
-      <w:r>
-        <w:rPr>
-          <w:rStyle w:val="VerbatimChar"/>
-        </w:rPr>
-        <w:t xml:space="preserve">│  parent/         │ &gt; archivo1.txt    │ Contenido del    │</w:t>
-      </w:r>
-      <w:r>
-        <w:br/>
-      </w:r>
-      <w:r>
-        <w:rPr>
-          <w:rStyle w:val="VerbatimChar"/>
-        </w:rPr>
-        <w:t xml:space="preserve">│  current/        │   archivo2.py     │ archivo1.txt...  │</w:t>
-      </w:r>
-      <w:r>
-        <w:br/>
-      </w:r>
-      <w:r>
-        <w:rPr>
-          <w:rStyle w:val="VerbatimChar"/>
-        </w:rPr>
-        <w:t xml:space="preserve">│  sibling/        │   carpeta/        │                  │</w:t>
-      </w:r>
-      <w:r>
-        <w:br/>
-      </w:r>
-      <w:r>
-        <w:rPr>
-          <w:rStyle w:val="VerbatimChar"/>
-        </w:rPr>
-        <w:t xml:space="preserve">│                  │   imagen.png      │                  │</w:t>
-      </w:r>
-      <w:r>
-        <w:br/>
-      </w:r>
-      <w:r>
-        <w:rPr>
-          <w:rStyle w:val="VerbatimChar"/>
-        </w:rPr>
-        <w:t xml:space="preserve">│                  │                   │                  │</w:t>
-      </w:r>
-      <w:r>
-        <w:br/>
-      </w:r>
-      <w:r>
-        <w:rPr>
-          <w:rStyle w:val="VerbatimChar"/>
-        </w:rPr>
-        <w:t xml:space="preserve">├─────────────────────────────────────────────────────────┤</w:t>
-      </w:r>
-      <w:r>
-        <w:br/>
-      </w:r>
-      <w:r>
-        <w:rPr>
-          <w:rStyle w:val="VerbatimChar"/>
-        </w:rPr>
-        <w:t xml:space="preserve">│ Barra de Estado: PWD, permisos, tamaño, fecha           │</w:t>
-      </w:r>
-      <w:r>
-        <w:br/>
-      </w:r>
-      <w:r>
-        <w:rPr>
-          <w:rStyle w:val="VerbatimChar"/>
-        </w:rPr>
-        <w:t xml:space="preserve">└─────────────────────────────────────────────────────────┘</w:t>
-      </w:r>
-    </w:p>
-    <w:bookmarkEnd w:id="37"/>
-    <w:bookmarkStart w:id="38" w:name="columnas-explicadas"/>
+          <w:rStyle w:val="FunctionTok"/>
+        </w:rPr>
+        <w:t xml:space="preserve">sudo</w:t>
+      </w:r>
+      <w:r>
+        <w:rPr>
+          <w:rStyle w:val="NormalTok"/>
+        </w:rPr>
+        <w:t xml:space="preserve"> apt-get update</w:t>
+      </w:r>
+      <w:r>
+        <w:br/>
+      </w:r>
+      <w:r>
+        <w:rPr>
+          <w:rStyle w:val="FunctionTok"/>
+        </w:rPr>
+        <w:t xml:space="preserve">sudo</w:t>
+      </w:r>
+      <w:r>
+        <w:rPr>
+          <w:rStyle w:val="NormalTok"/>
+        </w:rPr>
+        <w:t xml:space="preserve"> apt-get install ranger</w:t>
+      </w:r>
+    </w:p>
+    <w:p>
+      <w:pPr>
+        <w:pStyle w:val="FirstParagraph"/>
+      </w:pPr>
+      <w:r>
+        <w:rPr>
+          <w:b/>
+          <w:bCs/>
+        </w:rPr>
+        <w:t xml:space="preserve">Fedora:</w:t>
+      </w:r>
+    </w:p>
+    <w:p>
+      <w:pPr>
+        <w:pStyle w:val="SourceCode"/>
+      </w:pPr>
+      <w:r>
+        <w:rPr>
+          <w:rStyle w:val="FunctionTok"/>
+        </w:rPr>
+        <w:t xml:space="preserve">sudo</w:t>
+      </w:r>
+      <w:r>
+        <w:rPr>
+          <w:rStyle w:val="NormalTok"/>
+        </w:rPr>
+        <w:t xml:space="preserve"> dnf install ranger</w:t>
+      </w:r>
+    </w:p>
+    <w:p>
+      <w:pPr>
+        <w:pStyle w:val="FirstParagraph"/>
+      </w:pPr>
+      <w:r>
+        <w:rPr>
+          <w:b/>
+          <w:bCs/>
+        </w:rPr>
+        <w:t xml:space="preserve">Arch Linux:</w:t>
+      </w:r>
+    </w:p>
+    <w:p>
+      <w:pPr>
+        <w:pStyle w:val="SourceCode"/>
+      </w:pPr>
+      <w:r>
+        <w:rPr>
+          <w:rStyle w:val="FunctionTok"/>
+        </w:rPr>
+        <w:t xml:space="preserve">sudo</w:t>
+      </w:r>
+      <w:r>
+        <w:rPr>
+          <w:rStyle w:val="NormalTok"/>
+        </w:rPr>
+        <w:t xml:space="preserve"> pacman </w:t>
+      </w:r>
+      <w:r>
+        <w:rPr>
+          <w:rStyle w:val="AttributeTok"/>
+        </w:rPr>
+        <w:t xml:space="preserve">-S</w:t>
+      </w:r>
+      <w:r>
+        <w:rPr>
+          <w:rStyle w:val="NormalTok"/>
+        </w:rPr>
+        <w:t xml:space="preserve"> ranger</w:t>
+      </w:r>
+    </w:p>
+    <w:p>
+      <w:pPr>
+        <w:pStyle w:val="FirstParagraph"/>
+      </w:pPr>
+      <w:r>
+        <w:rPr>
+          <w:b/>
+          <w:bCs/>
+        </w:rPr>
+        <w:t xml:space="preserve">macOS (Homebrew):</w:t>
+      </w:r>
+    </w:p>
+    <w:p>
+      <w:pPr>
+        <w:pStyle w:val="SourceCode"/>
+      </w:pPr>
+      <w:r>
+        <w:rPr>
+          <w:rStyle w:val="ExtensionTok"/>
+        </w:rPr>
+        <w:t xml:space="preserve">brew</w:t>
+      </w:r>
+      <w:r>
+        <w:rPr>
+          <w:rStyle w:val="NormalTok"/>
+        </w:rPr>
+        <w:t xml:space="preserve"> install ranger</w:t>
+      </w:r>
+    </w:p>
+    <w:bookmarkEnd w:id="27"/>
+    <w:bookmarkStart w:id="28" w:name="desde-pypi"/>
     <w:p>
       <w:pPr>
         <w:pStyle w:val="Heading2"/>
       </w:pPr>
       <w:r>
-        <w:t xml:space="preserve">3.2 Columnas Explicadas</w:t>
+        <w:t xml:space="preserve">1.2 Desde PyPI</w:t>
+      </w:r>
+    </w:p>
+    <w:p>
+      <w:pPr>
+        <w:pStyle w:val="SourceCode"/>
+      </w:pPr>
+      <w:r>
+        <w:rPr>
+          <w:rStyle w:val="ExtensionTok"/>
+        </w:rPr>
+        <w:t xml:space="preserve">pip</w:t>
+      </w:r>
+      <w:r>
+        <w:rPr>
+          <w:rStyle w:val="NormalTok"/>
+        </w:rPr>
+        <w:t xml:space="preserve"> install ranger-fm</w:t>
+      </w:r>
+      <w:r>
+        <w:br/>
+      </w:r>
+      <w:r>
+        <w:rPr>
+          <w:rStyle w:val="CommentTok"/>
+        </w:rPr>
+        <w:t xml:space="preserve"># O mejor con pipx (entorno aislado)</w:t>
+      </w:r>
+      <w:r>
+        <w:br/>
+      </w:r>
+      <w:r>
+        <w:rPr>
+          <w:rStyle w:val="ExtensionTok"/>
+        </w:rPr>
+        <w:t xml:space="preserve">pipx</w:t>
+      </w:r>
+      <w:r>
+        <w:rPr>
+          <w:rStyle w:val="NormalTok"/>
+        </w:rPr>
+        <w:t xml:space="preserve"> install ranger-fm</w:t>
+      </w:r>
+    </w:p>
+    <w:bookmarkEnd w:id="28"/>
+    <w:bookmarkStart w:id="29" w:name="desde-código-fuente"/>
+    <w:p>
+      <w:pPr>
+        <w:pStyle w:val="Heading2"/>
+      </w:pPr>
+      <w:r>
+        <w:t xml:space="preserve">1.3 Desde Código Fuente</w:t>
+      </w:r>
+    </w:p>
+    <w:p>
+      <w:pPr>
+        <w:pStyle w:val="SourceCode"/>
+      </w:pPr>
+      <w:r>
+        <w:rPr>
+          <w:rStyle w:val="FunctionTok"/>
+        </w:rPr>
+        <w:t xml:space="preserve">git</w:t>
+      </w:r>
+      <w:r>
+        <w:rPr>
+          <w:rStyle w:val="NormalTok"/>
+        </w:rPr>
+        <w:t xml:space="preserve"> clone https://github.com/ranger/ranger.git</w:t>
+      </w:r>
+      <w:r>
+        <w:br/>
+      </w:r>
+      <w:r>
+        <w:rPr>
+          <w:rStyle w:val="BuiltInTok"/>
+        </w:rPr>
+        <w:t xml:space="preserve">cd</w:t>
+      </w:r>
+      <w:r>
+        <w:rPr>
+          <w:rStyle w:val="NormalTok"/>
+        </w:rPr>
+        <w:t xml:space="preserve"> ranger</w:t>
+      </w:r>
+      <w:r>
+        <w:br/>
+      </w:r>
+      <w:r>
+        <w:rPr>
+          <w:rStyle w:val="FunctionTok"/>
+        </w:rPr>
+        <w:t xml:space="preserve">sudo</w:t>
+      </w:r>
+      <w:r>
+        <w:rPr>
+          <w:rStyle w:val="NormalTok"/>
+        </w:rPr>
+        <w:t xml:space="preserve"> make install</w:t>
+      </w:r>
+    </w:p>
+    <w:bookmarkEnd w:id="29"/>
+    <w:bookmarkStart w:id="30" w:name="verificar-instalación"/>
+    <w:p>
+      <w:pPr>
+        <w:pStyle w:val="Heading2"/>
+      </w:pPr>
+      <w:r>
+        <w:t xml:space="preserve">1.4 Verificar Instalación</w:t>
+      </w:r>
+    </w:p>
+    <w:p>
+      <w:pPr>
+        <w:pStyle w:val="SourceCode"/>
+      </w:pPr>
+      <w:r>
+        <w:rPr>
+          <w:rStyle w:val="ExtensionTok"/>
+        </w:rPr>
+        <w:t xml:space="preserve">ranger</w:t>
+      </w:r>
+      <w:r>
+        <w:rPr>
+          <w:rStyle w:val="NormalTok"/>
+        </w:rPr>
+        <w:t xml:space="preserve"> </w:t>
+      </w:r>
+      <w:r>
+        <w:rPr>
+          <w:rStyle w:val="AttributeTok"/>
+        </w:rPr>
+        <w:t xml:space="preserve">--version</w:t>
+      </w:r>
+    </w:p>
+    <w:bookmarkEnd w:id="30"/>
+    <w:bookmarkStart w:id="31" w:name="dependencias-opcionales"/>
+    <w:p>
+      <w:pPr>
+        <w:pStyle w:val="Heading2"/>
+      </w:pPr>
+      <w:r>
+        <w:t xml:space="preserve">1.5 Dependencias Opcionales</w:t>
+      </w:r>
+    </w:p>
+    <w:p>
+      <w:pPr>
+        <w:pStyle w:val="FirstParagraph"/>
+      </w:pPr>
+      <w:r>
+        <w:rPr>
+          <w:b/>
+          <w:bCs/>
+        </w:rPr>
+        <w:t xml:space="preserve">Para funcionalidad completa:</w:t>
+      </w:r>
+    </w:p>
+    <w:p>
+      <w:pPr>
+        <w:pStyle w:val="SourceCode"/>
+      </w:pPr>
+      <w:r>
+        <w:rPr>
+          <w:rStyle w:val="CommentTok"/>
+        </w:rPr>
+        <w:t xml:space="preserve"># Determinar tipos de archivo</w:t>
+      </w:r>
+      <w:r>
+        <w:br/>
+      </w:r>
+      <w:r>
+        <w:rPr>
+          <w:rStyle w:val="FunctionTok"/>
+        </w:rPr>
+        <w:t xml:space="preserve">sudo</w:t>
+      </w:r>
+      <w:r>
+        <w:rPr>
+          <w:rStyle w:val="NormalTok"/>
+        </w:rPr>
+        <w:t xml:space="preserve"> apt-get install file</w:t>
+      </w:r>
+      <w:r>
+        <w:br/>
+      </w:r>
+      <w:r>
+        <w:br/>
+      </w:r>
+      <w:r>
+        <w:rPr>
+          <w:rStyle w:val="CommentTok"/>
+        </w:rPr>
+        <w:t xml:space="preserve"># Detección mejorada de codificación</w:t>
+      </w:r>
+      <w:r>
+        <w:br/>
+      </w:r>
+      <w:r>
+        <w:rPr>
+          <w:rStyle w:val="ExtensionTok"/>
+        </w:rPr>
+        <w:t xml:space="preserve">pip</w:t>
+      </w:r>
+      <w:r>
+        <w:rPr>
+          <w:rStyle w:val="NormalTok"/>
+        </w:rPr>
+        <w:t xml:space="preserve"> install chardet</w:t>
+      </w:r>
+      <w:r>
+        <w:br/>
+      </w:r>
+      <w:r>
+        <w:br/>
+      </w:r>
+      <w:r>
+        <w:rPr>
+          <w:rStyle w:val="CommentTok"/>
+        </w:rPr>
+        <w:t xml:space="preserve"># Nombres bidireccionales (árabe, hebreo)</w:t>
+      </w:r>
+      <w:r>
+        <w:br/>
+      </w:r>
+      <w:r>
+        <w:rPr>
+          <w:rStyle w:val="ExtensionTok"/>
+        </w:rPr>
+        <w:t xml:space="preserve">pip</w:t>
+      </w:r>
+      <w:r>
+        <w:rPr>
+          <w:rStyle w:val="NormalTok"/>
+        </w:rPr>
+        <w:t xml:space="preserve"> install python-bidi</w:t>
+      </w:r>
+      <w:r>
+        <w:br/>
+      </w:r>
+      <w:r>
+        <w:br/>
+      </w:r>
+      <w:r>
+        <w:rPr>
+          <w:rStyle w:val="CommentTok"/>
+        </w:rPr>
+        <w:t xml:space="preserve"># Previsualización de imágenes</w:t>
+      </w:r>
+      <w:r>
+        <w:br/>
+      </w:r>
+      <w:r>
+        <w:rPr>
+          <w:rStyle w:val="FunctionTok"/>
+        </w:rPr>
+        <w:t xml:space="preserve">sudo</w:t>
+      </w:r>
+      <w:r>
+        <w:rPr>
+          <w:rStyle w:val="NormalTok"/>
+        </w:rPr>
+        <w:t xml:space="preserve"> apt-get install caca-utils w3m-img</w:t>
+      </w:r>
+      <w:r>
+        <w:br/>
+      </w:r>
+      <w:r>
+        <w:br/>
+      </w:r>
+      <w:r>
+        <w:rPr>
+          <w:rStyle w:val="CommentTok"/>
+        </w:rPr>
+        <w:t xml:space="preserve"># Conversión de imágenes</w:t>
+      </w:r>
+      <w:r>
+        <w:br/>
+      </w:r>
+      <w:r>
+        <w:rPr>
+          <w:rStyle w:val="FunctionTok"/>
+        </w:rPr>
+        <w:t xml:space="preserve">sudo</w:t>
+      </w:r>
+      <w:r>
+        <w:rPr>
+          <w:rStyle w:val="NormalTok"/>
+        </w:rPr>
+        <w:t xml:space="preserve"> apt-get install imagemagick</w:t>
+      </w:r>
+      <w:r>
+        <w:br/>
+      </w:r>
+      <w:r>
+        <w:br/>
+      </w:r>
+      <w:r>
+        <w:rPr>
+          <w:rStyle w:val="CommentTok"/>
+        </w:rPr>
+        <w:t xml:space="preserve"># Resaltado de sintaxis</w:t>
+      </w:r>
+      <w:r>
+        <w:br/>
+      </w:r>
+      <w:r>
+        <w:rPr>
+          <w:rStyle w:val="FunctionTok"/>
+        </w:rPr>
+        <w:t xml:space="preserve">sudo</w:t>
+      </w:r>
+      <w:r>
+        <w:rPr>
+          <w:rStyle w:val="NormalTok"/>
+        </w:rPr>
+        <w:t xml:space="preserve"> apt-get install highlight</w:t>
+      </w:r>
+      <w:r>
+        <w:br/>
+      </w:r>
+      <w:r>
+        <w:rPr>
+          <w:rStyle w:val="CommentTok"/>
+        </w:rPr>
+        <w:t xml:space="preserve"># O</w:t>
+      </w:r>
+      <w:r>
+        <w:br/>
+      </w:r>
+      <w:r>
+        <w:rPr>
+          <w:rStyle w:val="ExtensionTok"/>
+        </w:rPr>
+        <w:t xml:space="preserve">pip</w:t>
+      </w:r>
+      <w:r>
+        <w:rPr>
+          <w:rStyle w:val="NormalTok"/>
+        </w:rPr>
+        <w:t xml:space="preserve"> install pygments</w:t>
+      </w:r>
+      <w:r>
+        <w:br/>
+      </w:r>
+      <w:r>
+        <w:br/>
+      </w:r>
+      <w:r>
+        <w:rPr>
+          <w:rStyle w:val="CommentTok"/>
+        </w:rPr>
+        <w:t xml:space="preserve"># Previsualización de archivos comprimidos</w:t>
+      </w:r>
+      <w:r>
+        <w:br/>
+      </w:r>
+      <w:r>
+        <w:rPr>
+          <w:rStyle w:val="FunctionTok"/>
+        </w:rPr>
+        <w:t xml:space="preserve">sudo</w:t>
+      </w:r>
+      <w:r>
+        <w:rPr>
+          <w:rStyle w:val="NormalTok"/>
+        </w:rPr>
+        <w:t xml:space="preserve"> apt-get install atool unrar p7zip-full</w:t>
+      </w:r>
+      <w:r>
+        <w:br/>
+      </w:r>
+      <w:r>
+        <w:br/>
+      </w:r>
+      <w:r>
+        <w:rPr>
+          <w:rStyle w:val="CommentTok"/>
+        </w:rPr>
+        <w:t xml:space="preserve"># Previsualización de PDFs</w:t>
+      </w:r>
+      <w:r>
+        <w:br/>
+      </w:r>
+      <w:r>
+        <w:rPr>
+          <w:rStyle w:val="FunctionTok"/>
+        </w:rPr>
+        <w:t xml:space="preserve">sudo</w:t>
+      </w:r>
+      <w:r>
+        <w:rPr>
+          <w:rStyle w:val="NormalTok"/>
+        </w:rPr>
+        <w:t xml:space="preserve"> apt-get install poppler-utils</w:t>
+      </w:r>
+      <w:r>
+        <w:br/>
+      </w:r>
+      <w:r>
+        <w:br/>
+      </w:r>
+      <w:r>
+        <w:rPr>
+          <w:rStyle w:val="CommentTok"/>
+        </w:rPr>
+        <w:t xml:space="preserve"># Previsualización de videos</w:t>
+      </w:r>
+      <w:r>
+        <w:br/>
+      </w:r>
+      <w:r>
+        <w:rPr>
+          <w:rStyle w:val="FunctionTok"/>
+        </w:rPr>
+        <w:t xml:space="preserve">sudo</w:t>
+      </w:r>
+      <w:r>
+        <w:rPr>
+          <w:rStyle w:val="NormalTok"/>
+        </w:rPr>
+        <w:t xml:space="preserve"> apt-get install ffmpegthumbnailer</w:t>
+      </w:r>
+      <w:r>
+        <w:br/>
+      </w:r>
+      <w:r>
+        <w:br/>
+      </w:r>
+      <w:r>
+        <w:rPr>
+          <w:rStyle w:val="CommentTok"/>
+        </w:rPr>
+        <w:t xml:space="preserve"># Información de medios</w:t>
+      </w:r>
+      <w:r>
+        <w:br/>
+      </w:r>
+      <w:r>
+        <w:rPr>
+          <w:rStyle w:val="FunctionTok"/>
+        </w:rPr>
+        <w:t xml:space="preserve">sudo</w:t>
+      </w:r>
+      <w:r>
+        <w:rPr>
+          <w:rStyle w:val="NormalTok"/>
+        </w:rPr>
+        <w:t xml:space="preserve"> apt-get install mediainfo</w:t>
+      </w:r>
+      <w:r>
+        <w:br/>
+      </w:r>
+      <w:r>
+        <w:br/>
+      </w:r>
+      <w:r>
+        <w:rPr>
+          <w:rStyle w:val="CommentTok"/>
+        </w:rPr>
+        <w:t xml:space="preserve"># Convertir SVG</w:t>
+      </w:r>
+      <w:r>
+        <w:br/>
+      </w:r>
+      <w:r>
+        <w:rPr>
+          <w:rStyle w:val="FunctionTok"/>
+        </w:rPr>
+        <w:t xml:space="preserve">sudo</w:t>
+      </w:r>
+      <w:r>
+        <w:rPr>
+          <w:rStyle w:val="NormalTok"/>
+        </w:rPr>
+        <w:t xml:space="preserve"> apt-get install librsvg2-bin</w:t>
+      </w:r>
+    </w:p>
+    <w:bookmarkEnd w:id="31"/>
+    <w:bookmarkEnd w:id="32"/>
+    <w:bookmarkStart w:id="36" w:name="configuración-inicial"/>
+    <w:p>
+      <w:pPr>
+        <w:pStyle w:val="Heading1"/>
+      </w:pPr>
+      <w:r>
+        <w:t xml:space="preserve">2. Configuración Inicial</w:t>
+      </w:r>
+    </w:p>
+    <w:bookmarkStart w:id="33" w:name="generar-archivos-de-configuración"/>
+    <w:p>
+      <w:pPr>
+        <w:pStyle w:val="Heading2"/>
+      </w:pPr>
+      <w:r>
+        <w:t xml:space="preserve">2.1 Generar Archivos de Configuración</w:t>
+      </w:r>
+    </w:p>
+    <w:p>
+      <w:pPr>
+        <w:pStyle w:val="FirstParagraph"/>
+      </w:pPr>
+      <w:r>
+        <w:t xml:space="preserve">Ranger puede copiar automáticamente los archivos de configuración por defecto:</w:t>
+      </w:r>
+    </w:p>
+    <w:p>
+      <w:pPr>
+        <w:pStyle w:val="SourceCode"/>
+      </w:pPr>
+      <w:r>
+        <w:rPr>
+          <w:rStyle w:val="CommentTok"/>
+        </w:rPr>
+        <w:t xml:space="preserve"># Copiar todas las configuraciones</w:t>
+      </w:r>
+      <w:r>
+        <w:br/>
+      </w:r>
+      <w:r>
+        <w:rPr>
+          <w:rStyle w:val="ExtensionTok"/>
+        </w:rPr>
+        <w:t xml:space="preserve">ranger</w:t>
+      </w:r>
+      <w:r>
+        <w:rPr>
+          <w:rStyle w:val="NormalTok"/>
+        </w:rPr>
+        <w:t xml:space="preserve"> </w:t>
+      </w:r>
+      <w:r>
+        <w:rPr>
+          <w:rStyle w:val="AttributeTok"/>
+        </w:rPr>
+        <w:t xml:space="preserve">--copy-config</w:t>
+      </w:r>
+      <w:r>
+        <w:rPr>
+          <w:rStyle w:val="OperatorTok"/>
+        </w:rPr>
+        <w:t xml:space="preserve">=</w:t>
+      </w:r>
+      <w:r>
+        <w:rPr>
+          <w:rStyle w:val="NormalTok"/>
+        </w:rPr>
+        <w:t xml:space="preserve">all</w:t>
+      </w:r>
+      <w:r>
+        <w:br/>
+      </w:r>
+      <w:r>
+        <w:br/>
+      </w:r>
+      <w:r>
+        <w:rPr>
+          <w:rStyle w:val="CommentTok"/>
+        </w:rPr>
+        <w:t xml:space="preserve"># Copiar archivos específicos</w:t>
+      </w:r>
+      <w:r>
+        <w:br/>
+      </w:r>
+      <w:r>
+        <w:rPr>
+          <w:rStyle w:val="ExtensionTok"/>
+        </w:rPr>
+        <w:t xml:space="preserve">ranger</w:t>
+      </w:r>
+      <w:r>
+        <w:rPr>
+          <w:rStyle w:val="NormalTok"/>
+        </w:rPr>
+        <w:t xml:space="preserve"> </w:t>
+      </w:r>
+      <w:r>
+        <w:rPr>
+          <w:rStyle w:val="AttributeTok"/>
+        </w:rPr>
+        <w:t xml:space="preserve">--copy-config</w:t>
+      </w:r>
+      <w:r>
+        <w:rPr>
+          <w:rStyle w:val="OperatorTok"/>
+        </w:rPr>
+        <w:t xml:space="preserve">=</w:t>
+      </w:r>
+      <w:r>
+        <w:rPr>
+          <w:rStyle w:val="NormalTok"/>
+        </w:rPr>
+        <w:t xml:space="preserve">rc          </w:t>
+      </w:r>
+      <w:r>
+        <w:rPr>
+          <w:rStyle w:val="CommentTok"/>
+        </w:rPr>
+        <w:t xml:space="preserve"># Configuración principal</w:t>
+      </w:r>
+      <w:r>
+        <w:br/>
+      </w:r>
+      <w:r>
+        <w:rPr>
+          <w:rStyle w:val="ExtensionTok"/>
+        </w:rPr>
+        <w:t xml:space="preserve">ranger</w:t>
+      </w:r>
+      <w:r>
+        <w:rPr>
+          <w:rStyle w:val="NormalTok"/>
+        </w:rPr>
+        <w:t xml:space="preserve"> </w:t>
+      </w:r>
+      <w:r>
+        <w:rPr>
+          <w:rStyle w:val="AttributeTok"/>
+        </w:rPr>
+        <w:t xml:space="preserve">--copy-config</w:t>
+      </w:r>
+      <w:r>
+        <w:rPr>
+          <w:rStyle w:val="OperatorTok"/>
+        </w:rPr>
+        <w:t xml:space="preserve">=</w:t>
+      </w:r>
+      <w:r>
+        <w:rPr>
+          <w:rStyle w:val="NormalTok"/>
+        </w:rPr>
+        <w:t xml:space="preserve">rifle       </w:t>
+      </w:r>
+      <w:r>
+        <w:rPr>
+          <w:rStyle w:val="CommentTok"/>
+        </w:rPr>
+        <w:t xml:space="preserve"># Configuración de rifle</w:t>
+      </w:r>
+      <w:r>
+        <w:br/>
+      </w:r>
+      <w:r>
+        <w:rPr>
+          <w:rStyle w:val="ExtensionTok"/>
+        </w:rPr>
+        <w:t xml:space="preserve">ranger</w:t>
+      </w:r>
+      <w:r>
+        <w:rPr>
+          <w:rStyle w:val="NormalTok"/>
+        </w:rPr>
+        <w:t xml:space="preserve"> </w:t>
+      </w:r>
+      <w:r>
+        <w:rPr>
+          <w:rStyle w:val="AttributeTok"/>
+        </w:rPr>
+        <w:t xml:space="preserve">--copy-config</w:t>
+      </w:r>
+      <w:r>
+        <w:rPr>
+          <w:rStyle w:val="OperatorTok"/>
+        </w:rPr>
+        <w:t xml:space="preserve">=</w:t>
+      </w:r>
+      <w:r>
+        <w:rPr>
+          <w:rStyle w:val="NormalTok"/>
+        </w:rPr>
+        <w:t xml:space="preserve">scope       </w:t>
+      </w:r>
+      <w:r>
+        <w:rPr>
+          <w:rStyle w:val="CommentTok"/>
+        </w:rPr>
+        <w:t xml:space="preserve"># Script de previsualización</w:t>
+      </w:r>
+      <w:r>
+        <w:br/>
+      </w:r>
+      <w:r>
+        <w:rPr>
+          <w:rStyle w:val="ExtensionTok"/>
+        </w:rPr>
+        <w:t xml:space="preserve">ranger</w:t>
+      </w:r>
+      <w:r>
+        <w:rPr>
+          <w:rStyle w:val="NormalTok"/>
+        </w:rPr>
+        <w:t xml:space="preserve"> </w:t>
+      </w:r>
+      <w:r>
+        <w:rPr>
+          <w:rStyle w:val="AttributeTok"/>
+        </w:rPr>
+        <w:t xml:space="preserve">--copy-config</w:t>
+      </w:r>
+      <w:r>
+        <w:rPr>
+          <w:rStyle w:val="OperatorTok"/>
+        </w:rPr>
+        <w:t xml:space="preserve">=</w:t>
+      </w:r>
+      <w:r>
+        <w:rPr>
+          <w:rStyle w:val="NormalTok"/>
+        </w:rPr>
+        <w:t xml:space="preserve">commands    </w:t>
+      </w:r>
+      <w:r>
+        <w:rPr>
+          <w:rStyle w:val="CommentTok"/>
+        </w:rPr>
+        <w:t xml:space="preserve"># Comandos personalizados</w:t>
+      </w:r>
+    </w:p>
+    <w:bookmarkEnd w:id="33"/>
+    <w:bookmarkStart w:id="34" w:name="ubicación-de-archivos"/>
+    <w:p>
+      <w:pPr>
+        <w:pStyle w:val="Heading2"/>
+      </w:pPr>
+      <w:r>
+        <w:t xml:space="preserve">2.2 Ubicación de Archivos</w:t>
+      </w:r>
+    </w:p>
+    <w:p>
+      <w:pPr>
+        <w:pStyle w:val="FirstParagraph"/>
+      </w:pPr>
+      <w:r>
+        <w:t xml:space="preserve">Los archivos de configuración se encuentran en:</w:t>
+      </w:r>
+    </w:p>
+    <w:p>
+      <w:pPr>
+        <w:pStyle w:val="SourceCode"/>
+      </w:pPr>
+      <w:r>
+        <w:rPr>
+          <w:rStyle w:val="ExtensionTok"/>
+        </w:rPr>
+        <w:t xml:space="preserve">~/.config/ranger/</w:t>
+      </w:r>
+      <w:r>
+        <w:br/>
+      </w:r>
+      <w:r>
+        <w:rPr>
+          <w:rStyle w:val="ExtensionTok"/>
+        </w:rPr>
+        <w:t xml:space="preserve">├──</w:t>
+      </w:r>
+      <w:r>
+        <w:rPr>
+          <w:rStyle w:val="NormalTok"/>
+        </w:rPr>
+        <w:t xml:space="preserve"> rc.conf           </w:t>
+      </w:r>
+      <w:r>
+        <w:rPr>
+          <w:rStyle w:val="CommentTok"/>
+        </w:rPr>
+        <w:t xml:space="preserve"># Configuración principal y atajos</w:t>
+      </w:r>
+      <w:r>
+        <w:br/>
+      </w:r>
+      <w:r>
+        <w:rPr>
+          <w:rStyle w:val="ExtensionTok"/>
+        </w:rPr>
+        <w:t xml:space="preserve">├──</w:t>
+      </w:r>
+      <w:r>
+        <w:rPr>
+          <w:rStyle w:val="NormalTok"/>
+        </w:rPr>
+        <w:t xml:space="preserve"> rifle.conf        </w:t>
+      </w:r>
+      <w:r>
+        <w:rPr>
+          <w:rStyle w:val="CommentTok"/>
+        </w:rPr>
+        <w:t xml:space="preserve"># Lanzador de archivos</w:t>
+      </w:r>
+      <w:r>
+        <w:br/>
+      </w:r>
+      <w:r>
+        <w:rPr>
+          <w:rStyle w:val="ExtensionTok"/>
+        </w:rPr>
+        <w:t xml:space="preserve">├──</w:t>
+      </w:r>
+      <w:r>
+        <w:rPr>
+          <w:rStyle w:val="NormalTok"/>
+        </w:rPr>
+        <w:t xml:space="preserve"> scope.sh          </w:t>
+      </w:r>
+      <w:r>
+        <w:rPr>
+          <w:rStyle w:val="CommentTok"/>
+        </w:rPr>
+        <w:t xml:space="preserve"># Script de previsualización</w:t>
+      </w:r>
+      <w:r>
+        <w:br/>
+      </w:r>
+      <w:r>
+        <w:rPr>
+          <w:rStyle w:val="ExtensionTok"/>
+        </w:rPr>
+        <w:t xml:space="preserve">├──</w:t>
+      </w:r>
+      <w:r>
+        <w:rPr>
+          <w:rStyle w:val="NormalTok"/>
+        </w:rPr>
+        <w:t xml:space="preserve"> commands.py       </w:t>
+      </w:r>
+      <w:r>
+        <w:rPr>
+          <w:rStyle w:val="CommentTok"/>
+        </w:rPr>
+        <w:t xml:space="preserve"># Comandos personalizados (Python)</w:t>
+      </w:r>
+      <w:r>
+        <w:br/>
+      </w:r>
+      <w:r>
+        <w:rPr>
+          <w:rStyle w:val="ExtensionTok"/>
+        </w:rPr>
+        <w:t xml:space="preserve">├──</w:t>
+      </w:r>
+      <w:r>
+        <w:rPr>
+          <w:rStyle w:val="NormalTok"/>
+        </w:rPr>
+        <w:t xml:space="preserve"> commands_full.py  </w:t>
+      </w:r>
+      <w:r>
+        <w:rPr>
+          <w:rStyle w:val="CommentTok"/>
+        </w:rPr>
+        <w:t xml:space="preserve"># Comandos adicionales</w:t>
+      </w:r>
+      <w:r>
+        <w:br/>
+      </w:r>
+      <w:r>
+        <w:rPr>
+          <w:rStyle w:val="ExtensionTok"/>
+        </w:rPr>
+        <w:t xml:space="preserve">└──</w:t>
+      </w:r>
+      <w:r>
+        <w:rPr>
+          <w:rStyle w:val="NormalTok"/>
+        </w:rPr>
+        <w:t xml:space="preserve"> plugins/          </w:t>
+      </w:r>
+      <w:r>
+        <w:rPr>
+          <w:rStyle w:val="CommentTok"/>
+        </w:rPr>
+        <w:t xml:space="preserve"># Directorio para plugins</w:t>
+      </w:r>
+    </w:p>
+    <w:bookmarkEnd w:id="34"/>
+    <w:bookmarkStart w:id="35" w:name="primer-lanzamiento"/>
+    <w:p>
+      <w:pPr>
+        <w:pStyle w:val="Heading2"/>
+      </w:pPr>
+      <w:r>
+        <w:t xml:space="preserve">2.3 Primer Lanzamiento</w:t>
+      </w:r>
+    </w:p>
+    <w:p>
+      <w:pPr>
+        <w:pStyle w:val="SourceCode"/>
+      </w:pPr>
+      <w:r>
+        <w:rPr>
+          <w:rStyle w:val="ExtensionTok"/>
+        </w:rPr>
+        <w:t xml:space="preserve">ranger</w:t>
+      </w:r>
+    </w:p>
+    <w:p>
+      <w:pPr>
+        <w:pStyle w:val="FirstParagraph"/>
+      </w:pPr>
+      <w:r>
+        <w:t xml:space="preserve">Al iniciar ranger por primera vez:</w:t>
       </w:r>
     </w:p>
     <w:p>
@@ -1690,14 +1625,7 @@
         </w:numPr>
       </w:pPr>
       <w:r>
-        <w:rPr>
-          <w:b/>
-          <w:bCs/>
-        </w:rPr>
-        <w:t xml:space="preserve">Columna Izquierda</w:t>
-      </w:r>
-      <w:r>
-        <w:t xml:space="preserve">: Contenido del directorio padre</w:t>
+        <w:t xml:space="preserve">Se abre en el directorio actual</w:t>
       </w:r>
     </w:p>
     <w:p>
@@ -1709,14 +1637,7 @@
         </w:numPr>
       </w:pPr>
       <w:r>
-        <w:rPr>
-          <w:b/>
-          <w:bCs/>
-        </w:rPr>
-        <w:t xml:space="preserve">Columna Central</w:t>
-      </w:r>
-      <w:r>
-        <w:t xml:space="preserve">: Directorio actual (principal)</w:t>
+        <w:t xml:space="preserve">Muestra tres columnas: padre, actual, previsualización</w:t>
       </w:r>
     </w:p>
     <w:p>
@@ -1728,32 +1649,213 @@
         </w:numPr>
       </w:pPr>
       <w:r>
-        <w:rPr>
-          <w:b/>
-          <w:bCs/>
-        </w:rPr>
-        <w:t xml:space="preserve">Columna Derecha</w:t>
-      </w:r>
-      <w:r>
-        <w:t xml:space="preserve">: Previsualización del archivo/directorio seleccionado</w:t>
-      </w:r>
-    </w:p>
-    <w:bookmarkEnd w:id="38"/>
-    <w:bookmarkStart w:id="39" w:name="barra-de-estado"/>
+        <w:t xml:space="preserve">Usa las flechas o</w:t>
+      </w:r>
+      <w:r>
+        <w:t xml:space="preserve"> </w:t>
+      </w:r>
+      <w:r>
+        <w:rPr>
+          <w:rStyle w:val="VerbatimChar"/>
+        </w:rPr>
+        <w:t xml:space="preserve">hjkl</w:t>
+      </w:r>
+      <w:r>
+        <w:t xml:space="preserve"> </w:t>
+      </w:r>
+      <w:r>
+        <w:t xml:space="preserve">para navegar</w:t>
+      </w:r>
+    </w:p>
+    <w:bookmarkEnd w:id="35"/>
+    <w:bookmarkEnd w:id="36"/>
+    <w:bookmarkStart w:id="40" w:name="interfaz-y-navegación-básica"/>
+    <w:p>
+      <w:pPr>
+        <w:pStyle w:val="Heading1"/>
+      </w:pPr>
+      <w:r>
+        <w:t xml:space="preserve">3. Interfaz y Navegación Básica</w:t>
+      </w:r>
+    </w:p>
+    <w:bookmarkStart w:id="37" w:name="estructura-de-la-pantalla"/>
     <w:p>
       <w:pPr>
         <w:pStyle w:val="Heading2"/>
       </w:pPr>
       <w:r>
-        <w:t xml:space="preserve">3.3 Barra de Estado</w:t>
-      </w:r>
-    </w:p>
-    <w:p>
-      <w:pPr>
-        <w:pStyle w:val="FirstParagraph"/>
-      </w:pPr>
-      <w:r>
-        <w:t xml:space="preserve">Muestra información del archivo seleccionado:</w:t>
+        <w:t xml:space="preserve">3.1 Estructura de la Pantalla</w:t>
+      </w:r>
+    </w:p>
+    <w:p>
+      <w:pPr>
+        <w:pStyle w:val="SourceCode"/>
+      </w:pPr>
+      <w:r>
+        <w:rPr>
+          <w:rStyle w:val="ExtensionTok"/>
+        </w:rPr>
+        <w:t xml:space="preserve">┌─────────────────────────────────────────────────────────┐</w:t>
+      </w:r>
+      <w:r>
+        <w:br/>
+      </w:r>
+      <w:r>
+        <w:rPr>
+          <w:rStyle w:val="ExtensionTok"/>
+        </w:rPr>
+        <w:t xml:space="preserve">│</w:t>
+      </w:r>
+      <w:r>
+        <w:rPr>
+          <w:rStyle w:val="NormalTok"/>
+        </w:rPr>
+        <w:t xml:space="preserve"> Directorio Padre │ Directorio Actual │ Previsualización │</w:t>
+      </w:r>
+      <w:r>
+        <w:br/>
+      </w:r>
+      <w:r>
+        <w:rPr>
+          <w:rStyle w:val="ExtensionTok"/>
+        </w:rPr>
+        <w:t xml:space="preserve">│</w:t>
+      </w:r>
+      <w:r>
+        <w:rPr>
+          <w:rStyle w:val="NormalTok"/>
+        </w:rPr>
+        <w:t xml:space="preserve">                  │                   │                  │</w:t>
+      </w:r>
+      <w:r>
+        <w:br/>
+      </w:r>
+      <w:r>
+        <w:rPr>
+          <w:rStyle w:val="ExtensionTok"/>
+        </w:rPr>
+        <w:t xml:space="preserve">│</w:t>
+      </w:r>
+      <w:r>
+        <w:rPr>
+          <w:rStyle w:val="NormalTok"/>
+        </w:rPr>
+        <w:t xml:space="preserve">  parent/         │ </w:t>
+      </w:r>
+      <w:r>
+        <w:rPr>
+          <w:rStyle w:val="OperatorTok"/>
+        </w:rPr>
+        <w:t xml:space="preserve">&gt;</w:t>
+      </w:r>
+      <w:r>
+        <w:rPr>
+          <w:rStyle w:val="NormalTok"/>
+        </w:rPr>
+        <w:t xml:space="preserve"> archivo1.txt    │ Contenido del    │</w:t>
+      </w:r>
+      <w:r>
+        <w:br/>
+      </w:r>
+      <w:r>
+        <w:rPr>
+          <w:rStyle w:val="ExtensionTok"/>
+        </w:rPr>
+        <w:t xml:space="preserve">│</w:t>
+      </w:r>
+      <w:r>
+        <w:rPr>
+          <w:rStyle w:val="NormalTok"/>
+        </w:rPr>
+        <w:t xml:space="preserve">  current/        │   archivo2.py     │ archivo1.txt...  │</w:t>
+      </w:r>
+      <w:r>
+        <w:br/>
+      </w:r>
+      <w:r>
+        <w:rPr>
+          <w:rStyle w:val="ExtensionTok"/>
+        </w:rPr>
+        <w:t xml:space="preserve">│</w:t>
+      </w:r>
+      <w:r>
+        <w:rPr>
+          <w:rStyle w:val="NormalTok"/>
+        </w:rPr>
+        <w:t xml:space="preserve">  sibling/        │   carpeta/        │                  │</w:t>
+      </w:r>
+      <w:r>
+        <w:br/>
+      </w:r>
+      <w:r>
+        <w:rPr>
+          <w:rStyle w:val="ExtensionTok"/>
+        </w:rPr>
+        <w:t xml:space="preserve">│</w:t>
+      </w:r>
+      <w:r>
+        <w:rPr>
+          <w:rStyle w:val="NormalTok"/>
+        </w:rPr>
+        <w:t xml:space="preserve">                  │   imagen.png      │                  │</w:t>
+      </w:r>
+      <w:r>
+        <w:br/>
+      </w:r>
+      <w:r>
+        <w:rPr>
+          <w:rStyle w:val="ExtensionTok"/>
+        </w:rPr>
+        <w:t xml:space="preserve">│</w:t>
+      </w:r>
+      <w:r>
+        <w:rPr>
+          <w:rStyle w:val="NormalTok"/>
+        </w:rPr>
+        <w:t xml:space="preserve">                  │                   │                  │</w:t>
+      </w:r>
+      <w:r>
+        <w:br/>
+      </w:r>
+      <w:r>
+        <w:rPr>
+          <w:rStyle w:val="ExtensionTok"/>
+        </w:rPr>
+        <w:t xml:space="preserve">├─────────────────────────────────────────────────────────┤</w:t>
+      </w:r>
+      <w:r>
+        <w:br/>
+      </w:r>
+      <w:r>
+        <w:rPr>
+          <w:rStyle w:val="ExtensionTok"/>
+        </w:rPr>
+        <w:t xml:space="preserve">│</w:t>
+      </w:r>
+      <w:r>
+        <w:rPr>
+          <w:rStyle w:val="NormalTok"/>
+        </w:rPr>
+        <w:t xml:space="preserve"> Barra de Estado: PWD, permisos, tamaño, fecha           │</w:t>
+      </w:r>
+      <w:r>
+        <w:br/>
+      </w:r>
+      <w:r>
+        <w:rPr>
+          <w:rStyle w:val="ExtensionTok"/>
+        </w:rPr>
+        <w:t xml:space="preserve">└─────────────────────────────────────────────────────────┘</w:t>
+      </w:r>
+    </w:p>
+    <w:bookmarkEnd w:id="37"/>
+    <w:bookmarkStart w:id="38" w:name="columnas"/>
+    <w:p>
+      <w:pPr>
+        <w:pStyle w:val="Heading2"/>
+      </w:pPr>
+      <w:r>
+        <w:t xml:space="preserve">3.2 Columnas</w:t>
       </w:r>
     </w:p>
     <w:p>
@@ -1765,7 +1867,14 @@
         </w:numPr>
       </w:pPr>
       <w:r>
-        <w:t xml:space="preserve">Permisos (rwxr-xr-x)</w:t>
+        <w:rPr>
+          <w:b/>
+          <w:bCs/>
+        </w:rPr>
+        <w:t xml:space="preserve">Columna Izquierda</w:t>
+      </w:r>
+      <w:r>
+        <w:t xml:space="preserve">: Contenido del directorio padre</w:t>
       </w:r>
     </w:p>
     <w:p>
@@ -1777,7 +1886,14 @@
         </w:numPr>
       </w:pPr>
       <w:r>
-        <w:t xml:space="preserve">Usuario y grupo propietario</w:t>
+        <w:rPr>
+          <w:b/>
+          <w:bCs/>
+        </w:rPr>
+        <w:t xml:space="preserve">Columna Central</w:t>
+      </w:r>
+      <w:r>
+        <w:t xml:space="preserve">: Directorio actual (principal)</w:t>
       </w:r>
     </w:p>
     <w:p>
@@ -1789,7 +1905,32 @@
         </w:numPr>
       </w:pPr>
       <w:r>
-        <w:t xml:space="preserve">Tamaño del archivo</w:t>
+        <w:rPr>
+          <w:b/>
+          <w:bCs/>
+        </w:rPr>
+        <w:t xml:space="preserve">Columna Derecha</w:t>
+      </w:r>
+      <w:r>
+        <w:t xml:space="preserve">: Previsualización del archivo/directorio seleccionado</w:t>
+      </w:r>
+    </w:p>
+    <w:bookmarkEnd w:id="38"/>
+    <w:bookmarkStart w:id="39" w:name="barra-de-estado"/>
+    <w:p>
+      <w:pPr>
+        <w:pStyle w:val="Heading2"/>
+      </w:pPr>
+      <w:r>
+        <w:t xml:space="preserve">3.3 Barra de Estado</w:t>
+      </w:r>
+    </w:p>
+    <w:p>
+      <w:pPr>
+        <w:pStyle w:val="FirstParagraph"/>
+      </w:pPr>
+      <w:r>
+        <w:t xml:space="preserve">Muestra información del archivo seleccionado:</w:t>
       </w:r>
     </w:p>
     <w:p>
@@ -1797,11 +1938,11 @@
         <w:pStyle w:val="Compact"/>
         <w:numPr>
           <w:ilvl w:val="0"/>
-          <w:numId w:val="1005"/>
+          <w:numId w:val="1006"/>
         </w:numPr>
       </w:pPr>
       <w:r>
-        <w:t xml:space="preserve">Fecha de modificación</w:t>
+        <w:t xml:space="preserve">Permisos (rwxr-xr-x)</w:t>
       </w:r>
     </w:p>
     <w:p>
@@ -1809,7 +1950,43 @@
         <w:pStyle w:val="Compact"/>
         <w:numPr>
           <w:ilvl w:val="0"/>
-          <w:numId w:val="1005"/>
+          <w:numId w:val="1006"/>
+        </w:numPr>
+      </w:pPr>
+      <w:r>
+        <w:t xml:space="preserve">Usuario y grupo propietario</w:t>
+      </w:r>
+    </w:p>
+    <w:p>
+      <w:pPr>
+        <w:pStyle w:val="Compact"/>
+        <w:numPr>
+          <w:ilvl w:val="0"/>
+          <w:numId w:val="1006"/>
+        </w:numPr>
+      </w:pPr>
+      <w:r>
+        <w:t xml:space="preserve">Tamaño del archivo</w:t>
+      </w:r>
+    </w:p>
+    <w:p>
+      <w:pPr>
+        <w:pStyle w:val="Compact"/>
+        <w:numPr>
+          <w:ilvl w:val="0"/>
+          <w:numId w:val="1006"/>
+        </w:numPr>
+      </w:pPr>
+      <w:r>
+        <w:t xml:space="preserve">Fecha de modificación</w:t>
+      </w:r>
+    </w:p>
+    <w:p>
+      <w:pPr>
+        <w:pStyle w:val="Compact"/>
+        <w:numPr>
+          <w:ilvl w:val="0"/>
+          <w:numId w:val="1006"/>
         </w:numPr>
       </w:pPr>
       <w:r>
@@ -3242,15 +3419,15 @@
         </w:rPr>
         <w:t xml:space="preserve">Ejemplo:</w:t>
       </w:r>
-      <w:r>
-        <w:t xml:space="preserve"> </w:t>
-      </w:r>
-      <w:r>
-        <w:t xml:space="preserve">-</w:t>
-      </w:r>
-      <w:r>
-        <w:t xml:space="preserve"> </w:t>
-      </w:r>
+    </w:p>
+    <w:p>
+      <w:pPr>
+        <w:pStyle w:val="Compact"/>
+        <w:numPr>
+          <w:ilvl w:val="0"/>
+          <w:numId w:val="1007"/>
+        </w:numPr>
+      </w:pPr>
       <w:r>
         <w:rPr>
           <w:rStyle w:val="VerbatimChar"/>
@@ -3269,15 +3446,15 @@
       <w:r>
         <w:t xml:space="preserve">‘t’</w:t>
       </w:r>
-      <w:r>
-        <w:t xml:space="preserve"> </w:t>
-      </w:r>
-      <w:r>
-        <w:t xml:space="preserve">-</w:t>
-      </w:r>
-      <w:r>
-        <w:t xml:space="preserve"> </w:t>
-      </w:r>
+    </w:p>
+    <w:p>
+      <w:pPr>
+        <w:pStyle w:val="Compact"/>
+        <w:numPr>
+          <w:ilvl w:val="0"/>
+          <w:numId w:val="1007"/>
+        </w:numPr>
+      </w:pPr>
       <w:r>
         <w:rPr>
           <w:rStyle w:val="VerbatimChar"/>
@@ -4309,27 +4486,63 @@
       </w:pPr>
       <w:r>
         <w:rPr>
-          <w:rStyle w:val="VerbatimChar"/>
-        </w:rPr>
-        <w:t xml:space="preserve">+x    # Añadir permiso de ejecución</w:t>
-      </w:r>
-      <w:r>
-        <w:br/>
-      </w:r>
-      <w:r>
-        <w:rPr>
-          <w:rStyle w:val="VerbatimChar"/>
-        </w:rPr>
-        <w:t xml:space="preserve">-w    # Quitar permiso de escritura</w:t>
-      </w:r>
-      <w:r>
-        <w:br/>
-      </w:r>
-      <w:r>
-        <w:rPr>
-          <w:rStyle w:val="VerbatimChar"/>
-        </w:rPr>
-        <w:t xml:space="preserve">=755  # Establecer permisos exactos</w:t>
+          <w:rStyle w:val="ExtensionTok"/>
+        </w:rPr>
+        <w:t xml:space="preserve">+x</w:t>
+      </w:r>
+      <w:r>
+        <w:rPr>
+          <w:rStyle w:val="NormalTok"/>
+        </w:rPr>
+        <w:t xml:space="preserve">    </w:t>
+      </w:r>
+      <w:r>
+        <w:rPr>
+          <w:rStyle w:val="CommentTok"/>
+        </w:rPr>
+        <w:t xml:space="preserve"># Añadir permiso de ejecución</w:t>
+      </w:r>
+      <w:r>
+        <w:br/>
+      </w:r>
+      <w:r>
+        <w:rPr>
+          <w:rStyle w:val="ExtensionTok"/>
+        </w:rPr>
+        <w:t xml:space="preserve">-w</w:t>
+      </w:r>
+      <w:r>
+        <w:rPr>
+          <w:rStyle w:val="NormalTok"/>
+        </w:rPr>
+        <w:t xml:space="preserve">    </w:t>
+      </w:r>
+      <w:r>
+        <w:rPr>
+          <w:rStyle w:val="CommentTok"/>
+        </w:rPr>
+        <w:t xml:space="preserve"># Quitar permiso de escritura</w:t>
+      </w:r>
+      <w:r>
+        <w:br/>
+      </w:r>
+      <w:r>
+        <w:rPr>
+          <w:rStyle w:val="ExtensionTok"/>
+        </w:rPr>
+        <w:t xml:space="preserve">=755</w:t>
+      </w:r>
+      <w:r>
+        <w:rPr>
+          <w:rStyle w:val="NormalTok"/>
+        </w:rPr>
+        <w:t xml:space="preserve">  </w:t>
+      </w:r>
+      <w:r>
+        <w:rPr>
+          <w:rStyle w:val="CommentTok"/>
+        </w:rPr>
+        <w:t xml:space="preserve"># Establecer permisos exactos</w:t>
       </w:r>
     </w:p>
     <w:bookmarkEnd w:id="53"/>
@@ -4530,7 +4743,7 @@
         <w:pStyle w:val="Compact"/>
         <w:numPr>
           <w:ilvl w:val="0"/>
-          <w:numId w:val="1006"/>
+          <w:numId w:val="1008"/>
         </w:numPr>
       </w:pPr>
       <w:r>
@@ -4551,7 +4764,7 @@
         <w:pStyle w:val="Compact"/>
         <w:numPr>
           <w:ilvl w:val="0"/>
-          <w:numId w:val="1006"/>
+          <w:numId w:val="1008"/>
         </w:numPr>
       </w:pPr>
       <w:r>
@@ -4572,7 +4785,7 @@
         <w:pStyle w:val="Compact"/>
         <w:numPr>
           <w:ilvl w:val="0"/>
-          <w:numId w:val="1006"/>
+          <w:numId w:val="1008"/>
         </w:numPr>
       </w:pPr>
       <w:r>
@@ -4611,7 +4824,7 @@
         <w:pStyle w:val="Compact"/>
         <w:numPr>
           <w:ilvl w:val="0"/>
-          <w:numId w:val="1007"/>
+          <w:numId w:val="1009"/>
         </w:numPr>
       </w:pPr>
       <w:r>
@@ -4632,7 +4845,7 @@
         <w:pStyle w:val="Compact"/>
         <w:numPr>
           <w:ilvl w:val="0"/>
-          <w:numId w:val="1007"/>
+          <w:numId w:val="1009"/>
         </w:numPr>
       </w:pPr>
       <w:r>
@@ -4653,7 +4866,7 @@
         <w:pStyle w:val="Compact"/>
         <w:numPr>
           <w:ilvl w:val="0"/>
-          <w:numId w:val="1007"/>
+          <w:numId w:val="1009"/>
         </w:numPr>
       </w:pPr>
       <w:r>
@@ -4674,7 +4887,7 @@
         <w:pStyle w:val="Compact"/>
         <w:numPr>
           <w:ilvl w:val="0"/>
-          <w:numId w:val="1007"/>
+          <w:numId w:val="1009"/>
         </w:numPr>
       </w:pPr>
       <w:r>
@@ -6189,6 +6402,21 @@
         <w:br/>
       </w:r>
       <w:r>
+        <w:br/>
+      </w:r>
+      <w:r>
+        <w:rPr>
+          <w:rStyle w:val="BuiltInTok"/>
+        </w:rPr>
+        <w:t xml:space="preserve">cd</w:t>
+      </w:r>
+      <w:r>
+        <w:rPr>
+          <w:rStyle w:val="NormalTok"/>
+        </w:rPr>
+        <w:t xml:space="preserve"> /etc   </w:t>
+      </w:r>
+      <w:r>
         <w:rPr>
           <w:rStyle w:val="CommentTok"/>
         </w:rPr>
@@ -6196,18 +6424,6 @@
       </w:r>
       <w:r>
         <w:br/>
-      </w:r>
-      <w:r>
-        <w:rPr>
-          <w:rStyle w:val="BuiltInTok"/>
-        </w:rPr>
-        <w:t xml:space="preserve">cd</w:t>
-      </w:r>
-      <w:r>
-        <w:rPr>
-          <w:rStyle w:val="NormalTok"/>
-        </w:rPr>
-        <w:t xml:space="preserve"> /etc</w:t>
       </w:r>
       <w:r>
         <w:br/>
@@ -6454,83 +6670,11 @@
         <w:pStyle w:val="Compact"/>
         <w:numPr>
           <w:ilvl w:val="0"/>
-          <w:numId w:val="1008"/>
+          <w:numId w:val="1010"/>
         </w:numPr>
       </w:pPr>
       <w:r>
         <w:t xml:space="preserve">Archivos de texto plano</w:t>
-      </w:r>
-    </w:p>
-    <w:p>
-      <w:pPr>
-        <w:pStyle w:val="Compact"/>
-        <w:numPr>
-          <w:ilvl w:val="0"/>
-          <w:numId w:val="1008"/>
-        </w:numPr>
-      </w:pPr>
-      <w:r>
-        <w:t xml:space="preserve">Código fuente con resaltado de sintaxis</w:t>
-      </w:r>
-    </w:p>
-    <w:p>
-      <w:pPr>
-        <w:pStyle w:val="Compact"/>
-        <w:numPr>
-          <w:ilvl w:val="0"/>
-          <w:numId w:val="1008"/>
-        </w:numPr>
-      </w:pPr>
-      <w:r>
-        <w:t xml:space="preserve">Archivos de configuración</w:t>
-      </w:r>
-    </w:p>
-    <w:p>
-      <w:pPr>
-        <w:pStyle w:val="FirstParagraph"/>
-      </w:pPr>
-      <w:r>
-        <w:rPr>
-          <w:b/>
-          <w:bCs/>
-        </w:rPr>
-        <w:t xml:space="preserve">Imágenes:</w:t>
-      </w:r>
-    </w:p>
-    <w:p>
-      <w:pPr>
-        <w:pStyle w:val="Compact"/>
-        <w:numPr>
-          <w:ilvl w:val="0"/>
-          <w:numId w:val="1009"/>
-        </w:numPr>
-      </w:pPr>
-      <w:r>
-        <w:t xml:space="preserve">Previsualización ASCII (con caca-utils)</w:t>
-      </w:r>
-    </w:p>
-    <w:p>
-      <w:pPr>
-        <w:pStyle w:val="Compact"/>
-        <w:numPr>
-          <w:ilvl w:val="0"/>
-          <w:numId w:val="1009"/>
-        </w:numPr>
-      </w:pPr>
-      <w:r>
-        <w:t xml:space="preserve">Previsualización real (con w3m-img, ueberzug, kitty, etc.)</w:t>
-      </w:r>
-    </w:p>
-    <w:p>
-      <w:pPr>
-        <w:pStyle w:val="FirstParagraph"/>
-      </w:pPr>
-      <w:r>
-        <w:rPr>
-          <w:b/>
-          <w:bCs/>
-        </w:rPr>
-        <w:t xml:space="preserve">Archivos Comprimidos:</w:t>
       </w:r>
     </w:p>
     <w:p>
@@ -6542,7 +6686,19 @@
         </w:numPr>
       </w:pPr>
       <w:r>
-        <w:t xml:space="preserve">Listado de contenido (.zip, .tar.gz, .rar, etc.)</w:t>
+        <w:t xml:space="preserve">Código fuente con resaltado de sintaxis</w:t>
+      </w:r>
+    </w:p>
+    <w:p>
+      <w:pPr>
+        <w:pStyle w:val="Compact"/>
+        <w:numPr>
+          <w:ilvl w:val="0"/>
+          <w:numId w:val="1010"/>
+        </w:numPr>
+      </w:pPr>
+      <w:r>
+        <w:t xml:space="preserve">Archivos de configuración</w:t>
       </w:r>
     </w:p>
     <w:p>
@@ -6554,7 +6710,7 @@
           <w:b/>
           <w:bCs/>
         </w:rPr>
-        <w:t xml:space="preserve">Documentos:</w:t>
+        <w:t xml:space="preserve">Imágenes:</w:t>
       </w:r>
     </w:p>
     <w:p>
@@ -6566,7 +6722,7 @@
         </w:numPr>
       </w:pPr>
       <w:r>
-        <w:t xml:space="preserve">PDFs (convertidos a texto con pdftotext)</w:t>
+        <w:t xml:space="preserve">Previsualización ASCII (con caca-utils)</w:t>
       </w:r>
     </w:p>
     <w:p>
@@ -6578,7 +6734,7 @@
         </w:numPr>
       </w:pPr>
       <w:r>
-        <w:t xml:space="preserve">Office documents (convertidos con herramientas apropiadas)</w:t>
+        <w:t xml:space="preserve">Previsualización real (con w3m-img, ueberzug, kitty, etc.)</w:t>
       </w:r>
     </w:p>
     <w:p>
@@ -6590,7 +6746,7 @@
           <w:b/>
           <w:bCs/>
         </w:rPr>
-        <w:t xml:space="preserve">Media:</w:t>
+        <w:t xml:space="preserve">Archivos Comprimidos:</w:t>
       </w:r>
     </w:p>
     <w:p>
@@ -6602,7 +6758,19 @@
         </w:numPr>
       </w:pPr>
       <w:r>
-        <w:t xml:space="preserve">Videos (miniaturas con ffmpegthumbnailer)</w:t>
+        <w:t xml:space="preserve">Listado de contenido (.zip, .tar.gz, .rar, etc.)</w:t>
+      </w:r>
+    </w:p>
+    <w:p>
+      <w:pPr>
+        <w:pStyle w:val="FirstParagraph"/>
+      </w:pPr>
+      <w:r>
+        <w:rPr>
+          <w:b/>
+          <w:bCs/>
+        </w:rPr>
+        <w:t xml:space="preserve">Documentos:</w:t>
       </w:r>
     </w:p>
     <w:p>
@@ -6610,7 +6778,55 @@
         <w:pStyle w:val="Compact"/>
         <w:numPr>
           <w:ilvl w:val="0"/>
-          <w:numId w:val="1012"/>
+          <w:numId w:val="1013"/>
+        </w:numPr>
+      </w:pPr>
+      <w:r>
+        <w:t xml:space="preserve">PDFs (convertidos a texto con pdftotext)</w:t>
+      </w:r>
+    </w:p>
+    <w:p>
+      <w:pPr>
+        <w:pStyle w:val="Compact"/>
+        <w:numPr>
+          <w:ilvl w:val="0"/>
+          <w:numId w:val="1013"/>
+        </w:numPr>
+      </w:pPr>
+      <w:r>
+        <w:t xml:space="preserve">Office documents (convertidos con herramientas apropiadas)</w:t>
+      </w:r>
+    </w:p>
+    <w:p>
+      <w:pPr>
+        <w:pStyle w:val="FirstParagraph"/>
+      </w:pPr>
+      <w:r>
+        <w:rPr>
+          <w:b/>
+          <w:bCs/>
+        </w:rPr>
+        <w:t xml:space="preserve">Media:</w:t>
+      </w:r>
+    </w:p>
+    <w:p>
+      <w:pPr>
+        <w:pStyle w:val="Compact"/>
+        <w:numPr>
+          <w:ilvl w:val="0"/>
+          <w:numId w:val="1014"/>
+        </w:numPr>
+      </w:pPr>
+      <w:r>
+        <w:t xml:space="preserve">Videos (miniaturas con ffmpegthumbnailer)</w:t>
+      </w:r>
+    </w:p>
+    <w:p>
+      <w:pPr>
+        <w:pStyle w:val="Compact"/>
+        <w:numPr>
+          <w:ilvl w:val="0"/>
+          <w:numId w:val="1014"/>
         </w:numPr>
       </w:pPr>
       <w:r>
@@ -8169,7 +8385,7 @@
         <w:pStyle w:val="Compact"/>
         <w:numPr>
           <w:ilvl w:val="0"/>
-          <w:numId w:val="1013"/>
+          <w:numId w:val="1015"/>
         </w:numPr>
       </w:pPr>
       <w:r>
@@ -8190,7 +8406,7 @@
         <w:pStyle w:val="Compact"/>
         <w:numPr>
           <w:ilvl w:val="0"/>
-          <w:numId w:val="1013"/>
+          <w:numId w:val="1015"/>
         </w:numPr>
       </w:pPr>
       <w:r>
@@ -10936,7 +11152,7 @@
         <w:pStyle w:val="Compact"/>
         <w:numPr>
           <w:ilvl w:val="0"/>
-          <w:numId w:val="1014"/>
+          <w:numId w:val="1016"/>
         </w:numPr>
       </w:pPr>
       <w:r>
@@ -10957,7 +11173,7 @@
         <w:pStyle w:val="Compact"/>
         <w:numPr>
           <w:ilvl w:val="0"/>
-          <w:numId w:val="1014"/>
+          <w:numId w:val="1016"/>
         </w:numPr>
       </w:pPr>
       <w:r>
@@ -10978,7 +11194,7 @@
         <w:pStyle w:val="Compact"/>
         <w:numPr>
           <w:ilvl w:val="0"/>
-          <w:numId w:val="1014"/>
+          <w:numId w:val="1016"/>
         </w:numPr>
       </w:pPr>
       <w:r>
@@ -10999,7 +11215,7 @@
         <w:pStyle w:val="Compact"/>
         <w:numPr>
           <w:ilvl w:val="0"/>
-          <w:numId w:val="1014"/>
+          <w:numId w:val="1016"/>
         </w:numPr>
       </w:pPr>
       <w:r>
@@ -11020,7 +11236,7 @@
         <w:pStyle w:val="Compact"/>
         <w:numPr>
           <w:ilvl w:val="0"/>
-          <w:numId w:val="1014"/>
+          <w:numId w:val="1016"/>
         </w:numPr>
       </w:pPr>
       <w:r>
@@ -11041,7 +11257,7 @@
         <w:pStyle w:val="Compact"/>
         <w:numPr>
           <w:ilvl w:val="0"/>
-          <w:numId w:val="1014"/>
+          <w:numId w:val="1016"/>
         </w:numPr>
       </w:pPr>
       <w:r>
@@ -11062,7 +11278,7 @@
         <w:pStyle w:val="Compact"/>
         <w:numPr>
           <w:ilvl w:val="0"/>
-          <w:numId w:val="1014"/>
+          <w:numId w:val="1016"/>
         </w:numPr>
       </w:pPr>
       <w:r>
@@ -12362,7 +12578,7 @@
         <w:rPr>
           <w:rStyle w:val="NormalTok"/>
         </w:rPr>
-        <w:t xml:space="preserve"> nueva-carpeta        </w:t>
+        <w:t xml:space="preserve"> nueva-carpeta         </w:t>
       </w:r>
       <w:r>
         <w:rPr>
@@ -12914,7 +13130,7 @@
         <w:pStyle w:val="Compact"/>
         <w:numPr>
           <w:ilvl w:val="0"/>
-          <w:numId w:val="1015"/>
+          <w:numId w:val="1017"/>
         </w:numPr>
       </w:pPr>
       <w:r>
@@ -12935,7 +13151,7 @@
         <w:pStyle w:val="Compact"/>
         <w:numPr>
           <w:ilvl w:val="0"/>
-          <w:numId w:val="1015"/>
+          <w:numId w:val="1017"/>
         </w:numPr>
       </w:pPr>
       <w:r>
@@ -12956,7 +13172,7 @@
         <w:pStyle w:val="Compact"/>
         <w:numPr>
           <w:ilvl w:val="0"/>
-          <w:numId w:val="1015"/>
+          <w:numId w:val="1017"/>
         </w:numPr>
       </w:pPr>
       <w:r>
@@ -12977,7 +13193,7 @@
         <w:pStyle w:val="Compact"/>
         <w:numPr>
           <w:ilvl w:val="0"/>
-          <w:numId w:val="1015"/>
+          <w:numId w:val="1017"/>
         </w:numPr>
       </w:pPr>
       <w:r>
@@ -12998,7 +13214,7 @@
         <w:pStyle w:val="Compact"/>
         <w:numPr>
           <w:ilvl w:val="0"/>
-          <w:numId w:val="1015"/>
+          <w:numId w:val="1017"/>
         </w:numPr>
       </w:pPr>
       <w:r>
@@ -16053,7 +16269,7 @@
         <w:pStyle w:val="Heading2"/>
       </w:pPr>
       <w:r>
-        <w:t xml:space="preserve">17.1 1. Preview de Archivos con Sintaxis</w:t>
+        <w:t xml:space="preserve">17.1 Preview de Archivos con Sintaxis</w:t>
       </w:r>
     </w:p>
     <w:p>
@@ -16419,7 +16635,7 @@
         <w:pStyle w:val="Heading2"/>
       </w:pPr>
       <w:r>
-        <w:t xml:space="preserve">17.2 2. Thumbnails de Videos</w:t>
+        <w:t xml:space="preserve">17.2 Thumbnails de Videos</w:t>
       </w:r>
     </w:p>
     <w:p>
@@ -16489,7 +16705,7 @@
         <w:pStyle w:val="Heading2"/>
       </w:pPr>
       <w:r>
-        <w:t xml:space="preserve">17.3 3. Preview de Imágenes (Terminal Compatible)</w:t>
+        <w:t xml:space="preserve">17.3 Preview de Imágenes (Terminal Compatible)</w:t>
       </w:r>
     </w:p>
     <w:p>
@@ -16645,7 +16861,7 @@
         <w:pStyle w:val="Heading2"/>
       </w:pPr>
       <w:r>
-        <w:t xml:space="preserve">17.4 4. Búsqueda con FZF</w:t>
+        <w:t xml:space="preserve">17.4 Búsqueda con FZF</w:t>
       </w:r>
     </w:p>
     <w:p>
@@ -17105,7 +17321,7 @@
         <w:pStyle w:val="Heading2"/>
       </w:pPr>
       <w:r>
-        <w:t xml:space="preserve">17.5 5. Integración con Git</w:t>
+        <w:t xml:space="preserve">17.5 Integración con Git</w:t>
       </w:r>
     </w:p>
     <w:p>
@@ -17175,7 +17391,7 @@
         <w:pStyle w:val="Heading2"/>
       </w:pPr>
       <w:r>
-        <w:t xml:space="preserve">17.6 6. Archivos Grandes</w:t>
+        <w:t xml:space="preserve">17.6 Archivos Grandes</w:t>
       </w:r>
     </w:p>
     <w:p>
@@ -17258,7 +17474,7 @@
         <w:pStyle w:val="Heading2"/>
       </w:pPr>
       <w:r>
-        <w:t xml:space="preserve">17.7 7. Abrir en Programa Externo</w:t>
+        <w:t xml:space="preserve">17.7 Abrir en Programa Externo</w:t>
       </w:r>
     </w:p>
     <w:p>
@@ -17467,7 +17683,7 @@
         <w:pStyle w:val="Heading2"/>
       </w:pPr>
       <w:r>
-        <w:t xml:space="preserve">17.8 8. Sincronizar con Dropbox/Drive</w:t>
+        <w:t xml:space="preserve">17.8 Sincronizar con Dropbox/Drive</w:t>
       </w:r>
     </w:p>
     <w:p>
@@ -17518,7 +17734,7 @@
         <w:pStyle w:val="Heading2"/>
       </w:pPr>
       <w:r>
-        <w:t xml:space="preserve">17.9 9. Operaciones Bulk</w:t>
+        <w:t xml:space="preserve">17.9 Operaciones Bulk</w:t>
       </w:r>
     </w:p>
     <w:p>
@@ -17595,7 +17811,7 @@
         <w:pStyle w:val="Heading2"/>
       </w:pPr>
       <w:r>
-        <w:t xml:space="preserve">17.10 10. Preview de Archivos JSON/YAML</w:t>
+        <w:t xml:space="preserve">17.10 Preview de Archivos JSON/YAML</w:t>
       </w:r>
     </w:p>
     <w:p>
@@ -18315,23 +18531,41 @@
         </w:rPr>
         <w:t xml:space="preserve">Soluciones:</w:t>
       </w:r>
-      <w:r>
-        <w:t xml:space="preserve"> </w:t>
-      </w:r>
-      <w:r>
-        <w:t xml:space="preserve">1. Limitar tamaño de preview</w:t>
-      </w:r>
-      <w:r>
-        <w:t xml:space="preserve"> </w:t>
-      </w:r>
-      <w:r>
-        <w:t xml:space="preserve">2. Desactivar preview de imágenes en directorios grandes</w:t>
-      </w:r>
-      <w:r>
-        <w:t xml:space="preserve"> </w:t>
-      </w:r>
-      <w:r>
-        <w:t xml:space="preserve">3. Reducir historial</w:t>
+    </w:p>
+    <w:p>
+      <w:pPr>
+        <w:pStyle w:val="Compact"/>
+        <w:numPr>
+          <w:ilvl w:val="0"/>
+          <w:numId w:val="1018"/>
+        </w:numPr>
+      </w:pPr>
+      <w:r>
+        <w:t xml:space="preserve">Limitar tamaño de preview</w:t>
+      </w:r>
+    </w:p>
+    <w:p>
+      <w:pPr>
+        <w:pStyle w:val="Compact"/>
+        <w:numPr>
+          <w:ilvl w:val="0"/>
+          <w:numId w:val="1018"/>
+        </w:numPr>
+      </w:pPr>
+      <w:r>
+        <w:t xml:space="preserve">Desactivar preview de imágenes en directorios grandes</w:t>
+      </w:r>
+    </w:p>
+    <w:p>
+      <w:pPr>
+        <w:pStyle w:val="Compact"/>
+        <w:numPr>
+          <w:ilvl w:val="0"/>
+          <w:numId w:val="1018"/>
+        </w:numPr>
+      </w:pPr>
+      <w:r>
+        <w:t xml:space="preserve">Reducir historial</w:t>
       </w:r>
     </w:p>
     <w:p>
@@ -21214,7 +21448,7 @@
         <w:pStyle w:val="Compact"/>
         <w:numPr>
           <w:ilvl w:val="0"/>
-          <w:numId w:val="1016"/>
+          <w:numId w:val="1019"/>
         </w:numPr>
       </w:pPr>
       <w:r>
@@ -21226,203 +21460,6 @@
       </w:r>
       <w:r>
         <w:t xml:space="preserve">: https://ranger.fm/</w:t>
-      </w:r>
-    </w:p>
-    <w:p>
-      <w:pPr>
-        <w:pStyle w:val="Compact"/>
-        <w:numPr>
-          <w:ilvl w:val="0"/>
-          <w:numId w:val="1016"/>
-        </w:numPr>
-      </w:pPr>
-      <w:r>
-        <w:rPr>
-          <w:b/>
-          <w:bCs/>
-        </w:rPr>
-        <w:t xml:space="preserve">GitHub</w:t>
-      </w:r>
-      <w:r>
-        <w:t xml:space="preserve">: https://github.com/ranger/ranger</w:t>
-      </w:r>
-    </w:p>
-    <w:p>
-      <w:pPr>
-        <w:pStyle w:val="Compact"/>
-        <w:numPr>
-          <w:ilvl w:val="0"/>
-          <w:numId w:val="1016"/>
-        </w:numPr>
-      </w:pPr>
-      <w:r>
-        <w:rPr>
-          <w:b/>
-          <w:bCs/>
-        </w:rPr>
-        <w:t xml:space="preserve">Manual</w:t>
-      </w:r>
-      <w:r>
-        <w:t xml:space="preserve">:</w:t>
-      </w:r>
-      <w:r>
-        <w:t xml:space="preserve"> </w:t>
-      </w:r>
-      <w:r>
-        <w:rPr>
-          <w:rStyle w:val="VerbatimChar"/>
-        </w:rPr>
-        <w:t xml:space="preserve">man ranger</w:t>
-      </w:r>
-      <w:r>
-        <w:t xml:space="preserve"> </w:t>
-      </w:r>
-      <w:r>
-        <w:t xml:space="preserve">o https://ranger.fm/man.html</w:t>
-      </w:r>
-    </w:p>
-    <w:p>
-      <w:pPr>
-        <w:pStyle w:val="Compact"/>
-        <w:numPr>
-          <w:ilvl w:val="0"/>
-          <w:numId w:val="1016"/>
-        </w:numPr>
-      </w:pPr>
-      <w:r>
-        <w:rPr>
-          <w:b/>
-          <w:bCs/>
-        </w:rPr>
-        <w:t xml:space="preserve">Wiki</w:t>
-      </w:r>
-      <w:r>
-        <w:t xml:space="preserve">: https://github.com/ranger/ranger/wiki</w:t>
-      </w:r>
-    </w:p>
-    <w:bookmarkEnd w:id="143"/>
-    <w:bookmarkStart w:id="144" w:name="tutoriales"/>
-    <w:p>
-      <w:pPr>
-        <w:pStyle w:val="Heading2"/>
-      </w:pPr>
-      <w:r>
-        <w:t xml:space="preserve">20.2 Tutoriales</w:t>
-      </w:r>
-    </w:p>
-    <w:p>
-      <w:pPr>
-        <w:pStyle w:val="Compact"/>
-        <w:numPr>
-          <w:ilvl w:val="0"/>
-          <w:numId w:val="1017"/>
-        </w:numPr>
-      </w:pPr>
-      <w:r>
-        <w:rPr>
-          <w:b/>
-          <w:bCs/>
-        </w:rPr>
-        <w:t xml:space="preserve">Official User Guide</w:t>
-      </w:r>
-      <w:r>
-        <w:t xml:space="preserve">: En el repositorio de GitHub</w:t>
-      </w:r>
-    </w:p>
-    <w:p>
-      <w:pPr>
-        <w:pStyle w:val="Compact"/>
-        <w:numPr>
-          <w:ilvl w:val="0"/>
-          <w:numId w:val="1017"/>
-        </w:numPr>
-      </w:pPr>
-      <w:r>
-        <w:rPr>
-          <w:b/>
-          <w:bCs/>
-        </w:rPr>
-        <w:t xml:space="preserve">Arch Wiki</w:t>
-      </w:r>
-      <w:r>
-        <w:t xml:space="preserve">: https://wiki.archlinux.org/title/Ranger</w:t>
-      </w:r>
-    </w:p>
-    <w:bookmarkEnd w:id="144"/>
-    <w:bookmarkStart w:id="145" w:name="comunidad"/>
-    <w:p>
-      <w:pPr>
-        <w:pStyle w:val="Heading2"/>
-      </w:pPr>
-      <w:r>
-        <w:t xml:space="preserve">20.3 Comunidad</w:t>
-      </w:r>
-    </w:p>
-    <w:p>
-      <w:pPr>
-        <w:pStyle w:val="Compact"/>
-        <w:numPr>
-          <w:ilvl w:val="0"/>
-          <w:numId w:val="1018"/>
-        </w:numPr>
-      </w:pPr>
-      <w:r>
-        <w:rPr>
-          <w:b/>
-          <w:bCs/>
-        </w:rPr>
-        <w:t xml:space="preserve">IRC</w:t>
-      </w:r>
-      <w:r>
-        <w:t xml:space="preserve">: #ranger en Libera.Chat</w:t>
-      </w:r>
-    </w:p>
-    <w:p>
-      <w:pPr>
-        <w:pStyle w:val="Compact"/>
-        <w:numPr>
-          <w:ilvl w:val="0"/>
-          <w:numId w:val="1018"/>
-        </w:numPr>
-      </w:pPr>
-      <w:r>
-        <w:rPr>
-          <w:b/>
-          <w:bCs/>
-        </w:rPr>
-        <w:t xml:space="preserve">Reddit</w:t>
-      </w:r>
-      <w:r>
-        <w:t xml:space="preserve">: r/ranger</w:t>
-      </w:r>
-    </w:p>
-    <w:p>
-      <w:pPr>
-        <w:pStyle w:val="Compact"/>
-        <w:numPr>
-          <w:ilvl w:val="0"/>
-          <w:numId w:val="1018"/>
-        </w:numPr>
-      </w:pPr>
-      <w:r>
-        <w:rPr>
-          <w:b/>
-          <w:bCs/>
-        </w:rPr>
-        <w:t xml:space="preserve">Issues</w:t>
-      </w:r>
-      <w:r>
-        <w:t xml:space="preserve">: https://github.com/ranger/ranger/issues</w:t>
-      </w:r>
-    </w:p>
-    <w:bookmarkEnd w:id="145"/>
-    <w:bookmarkStart w:id="146" w:name="configuraciones-de-ejemplo"/>
-    <w:p>
-      <w:pPr>
-        <w:pStyle w:val="Heading2"/>
-      </w:pPr>
-      <w:r>
-        <w:t xml:space="preserve">20.4 Configuraciones de Ejemplo</w:t>
       </w:r>
     </w:p>
     <w:p>
@@ -21438,16 +21475,10 @@
           <w:b/>
           <w:bCs/>
         </w:rPr>
-        <w:t xml:space="preserve">Dotfiles repos</w:t>
-      </w:r>
-      <w:r>
-        <w:t xml:space="preserve">: Buscar en GitHub</w:t>
-      </w:r>
-      <w:r>
-        <w:t xml:space="preserve"> </w:t>
-      </w:r>
-      <w:r>
-        <w:t xml:space="preserve">“ranger config”</w:t>
+        <w:t xml:space="preserve">GitHub</w:t>
+      </w:r>
+      <w:r>
+        <w:t xml:space="preserve">: https://github.com/ranger/ranger</w:t>
       </w:r>
     </w:p>
     <w:p>
@@ -21463,41 +21494,54 @@
           <w:b/>
           <w:bCs/>
         </w:rPr>
-        <w:t xml:space="preserve">r/unixporn</w:t>
-      </w:r>
-      <w:r>
-        <w:t xml:space="preserve">: Muchas configuraciones compartidas</w:t>
-      </w:r>
-    </w:p>
-    <w:bookmarkEnd w:id="146"/>
-    <w:bookmarkEnd w:id="147"/>
-    <w:bookmarkStart w:id="148" w:name="conclusión"/>
-    <w:p>
-      <w:pPr>
-        <w:pStyle w:val="Heading1"/>
-      </w:pPr>
-      <w:r>
-        <w:t xml:space="preserve">21. Conclusión</w:t>
-      </w:r>
-    </w:p>
-    <w:p>
-      <w:pPr>
-        <w:pStyle w:val="FirstParagraph"/>
-      </w:pPr>
-      <w:r>
-        <w:t xml:space="preserve">Ranger es una herramienta poderosa que combina la eficiencia de los atajos de teclado estilo Vim con las capacidades modernas de previsualización y gestión de archivos.</w:t>
-      </w:r>
-    </w:p>
-    <w:p>
-      <w:pPr>
-        <w:pStyle w:val="BodyText"/>
+        <w:t xml:space="preserve">Manual</w:t>
+      </w:r>
+      <w:r>
+        <w:t xml:space="preserve">:</w:t>
+      </w:r>
+      <w:r>
+        <w:t xml:space="preserve"> </w:t>
+      </w:r>
+      <w:r>
+        <w:rPr>
+          <w:rStyle w:val="VerbatimChar"/>
+        </w:rPr>
+        <w:t xml:space="preserve">man ranger</w:t>
+      </w:r>
+      <w:r>
+        <w:t xml:space="preserve"> </w:t>
+      </w:r>
+      <w:r>
+        <w:t xml:space="preserve">o https://ranger.fm/man.html</w:t>
+      </w:r>
+    </w:p>
+    <w:p>
+      <w:pPr>
+        <w:pStyle w:val="Compact"/>
+        <w:numPr>
+          <w:ilvl w:val="0"/>
+          <w:numId w:val="1019"/>
+        </w:numPr>
       </w:pPr>
       <w:r>
         <w:rPr>
           <w:b/>
           <w:bCs/>
         </w:rPr>
-        <w:t xml:space="preserve">Consejos finales:</w:t>
+        <w:t xml:space="preserve">Wiki</w:t>
+      </w:r>
+      <w:r>
+        <w:t xml:space="preserve">: https://github.com/ranger/ranger/wiki</w:t>
+      </w:r>
+    </w:p>
+    <w:bookmarkEnd w:id="143"/>
+    <w:bookmarkStart w:id="144" w:name="tutoriales"/>
+    <w:p>
+      <w:pPr>
+        <w:pStyle w:val="Heading2"/>
+      </w:pPr>
+      <w:r>
+        <w:t xml:space="preserve">20.2 Tutoriales</w:t>
       </w:r>
     </w:p>
     <w:p>
@@ -21513,10 +21557,10 @@
           <w:b/>
           <w:bCs/>
         </w:rPr>
-        <w:t xml:space="preserve">Aprende gradualmente</w:t>
-      </w:r>
-      <w:r>
-        <w:t xml:space="preserve">: Comienza con los atajos básicos (hjkl, yy, dd, pp)</w:t>
+        <w:t xml:space="preserve">Official User Guide</w:t>
+      </w:r>
+      <w:r>
+        <w:t xml:space="preserve">: En el repositorio de GitHub</w:t>
       </w:r>
     </w:p>
     <w:p>
@@ -21532,79 +21576,20 @@
           <w:b/>
           <w:bCs/>
         </w:rPr>
-        <w:t xml:space="preserve">Personaliza</w:t>
-      </w:r>
-      <w:r>
-        <w:t xml:space="preserve">: Ajusta rc.conf a tu flujo de trabajo</w:t>
-      </w:r>
-    </w:p>
-    <w:p>
-      <w:pPr>
-        <w:pStyle w:val="Compact"/>
-        <w:numPr>
-          <w:ilvl w:val="0"/>
-          <w:numId w:val="1020"/>
-        </w:numPr>
-      </w:pPr>
-      <w:r>
-        <w:rPr>
-          <w:b/>
-          <w:bCs/>
-        </w:rPr>
-        <w:t xml:space="preserve">Practica</w:t>
-      </w:r>
-      <w:r>
-        <w:t xml:space="preserve">: La memoria muscular viene con el uso</w:t>
-      </w:r>
-    </w:p>
-    <w:p>
-      <w:pPr>
-        <w:pStyle w:val="Compact"/>
-        <w:numPr>
-          <w:ilvl w:val="0"/>
-          <w:numId w:val="1020"/>
-        </w:numPr>
-      </w:pPr>
-      <w:r>
-        <w:rPr>
-          <w:b/>
-          <w:bCs/>
-        </w:rPr>
-        <w:t xml:space="preserve">Explora plugins</w:t>
-      </w:r>
-      <w:r>
-        <w:t xml:space="preserve">: Hay muchas extensiones útiles</w:t>
-      </w:r>
-    </w:p>
-    <w:p>
-      <w:pPr>
-        <w:pStyle w:val="Compact"/>
-        <w:numPr>
-          <w:ilvl w:val="0"/>
-          <w:numId w:val="1020"/>
-        </w:numPr>
-      </w:pPr>
-      <w:r>
-        <w:rPr>
-          <w:b/>
-          <w:bCs/>
-        </w:rPr>
-        <w:t xml:space="preserve">Lee el código</w:t>
-      </w:r>
-      <w:r>
-        <w:t xml:space="preserve">: Ranger es Python, fácil de extender</w:t>
-      </w:r>
-    </w:p>
-    <w:p>
-      <w:pPr>
-        <w:pStyle w:val="FirstParagraph"/>
-      </w:pPr>
-      <w:r>
-        <w:rPr>
-          <w:b/>
-          <w:bCs/>
-        </w:rPr>
-        <w:t xml:space="preserve">Atajos esenciales para memorizar:</w:t>
+        <w:t xml:space="preserve">Arch Wiki</w:t>
+      </w:r>
+      <w:r>
+        <w:t xml:space="preserve">: https://wiki.archlinux.org/title/Ranger</w:t>
+      </w:r>
+    </w:p>
+    <w:bookmarkEnd w:id="144"/>
+    <w:bookmarkStart w:id="145" w:name="comunidad"/>
+    <w:p>
+      <w:pPr>
+        <w:pStyle w:val="Heading2"/>
+      </w:pPr>
+      <w:r>
+        <w:t xml:space="preserve">20.3 Comunidad</w:t>
       </w:r>
     </w:p>
     <w:p>
@@ -21617,15 +21602,13 @@
       </w:pPr>
       <w:r>
         <w:rPr>
-          <w:rStyle w:val="VerbatimChar"/>
-        </w:rPr>
-        <w:t xml:space="preserve">hjkl</w:t>
-      </w:r>
-      <w:r>
-        <w:t xml:space="preserve"> </w:t>
-      </w:r>
-      <w:r>
-        <w:t xml:space="preserve">- Navegación</w:t>
+          <w:b/>
+          <w:bCs/>
+        </w:rPr>
+        <w:t xml:space="preserve">IRC</w:t>
+      </w:r>
+      <w:r>
+        <w:t xml:space="preserve">: #ranger en Libera.Chat</w:t>
       </w:r>
     </w:p>
     <w:p>
@@ -21638,15 +21621,13 @@
       </w:pPr>
       <w:r>
         <w:rPr>
-          <w:rStyle w:val="VerbatimChar"/>
-        </w:rPr>
-        <w:t xml:space="preserve">yy/dd/pp</w:t>
-      </w:r>
-      <w:r>
-        <w:t xml:space="preserve"> </w:t>
-      </w:r>
-      <w:r>
-        <w:t xml:space="preserve">- Copiar/cortar/pegar</w:t>
+          <w:b/>
+          <w:bCs/>
+        </w:rPr>
+        <w:t xml:space="preserve">Reddit</w:t>
+      </w:r>
+      <w:r>
+        <w:t xml:space="preserve">: r/ranger</w:t>
       </w:r>
     </w:p>
     <w:p>
@@ -21659,117 +21640,23 @@
       </w:pPr>
       <w:r>
         <w:rPr>
-          <w:rStyle w:val="VerbatimChar"/>
-        </w:rPr>
-        <w:t xml:space="preserve">Space</w:t>
-      </w:r>
-      <w:r>
-        <w:t xml:space="preserve"> </w:t>
-      </w:r>
-      <w:r>
-        <w:t xml:space="preserve">- Seleccionar</w:t>
-      </w:r>
-    </w:p>
-    <w:p>
-      <w:pPr>
-        <w:pStyle w:val="Compact"/>
-        <w:numPr>
-          <w:ilvl w:val="0"/>
-          <w:numId w:val="1021"/>
-        </w:numPr>
-      </w:pPr>
-      <w:r>
-        <w:rPr>
-          <w:rStyle w:val="VerbatimChar"/>
-        </w:rPr>
-        <w:t xml:space="preserve">gg/G</w:t>
-      </w:r>
-      <w:r>
-        <w:t xml:space="preserve"> </w:t>
-      </w:r>
-      <w:r>
-        <w:t xml:space="preserve">- Inicio/fin</w:t>
-      </w:r>
-    </w:p>
-    <w:p>
-      <w:pPr>
-        <w:pStyle w:val="Compact"/>
-        <w:numPr>
-          <w:ilvl w:val="0"/>
-          <w:numId w:val="1021"/>
-        </w:numPr>
-      </w:pPr>
-      <w:r>
-        <w:rPr>
-          <w:rStyle w:val="VerbatimChar"/>
-        </w:rPr>
-        <w:t xml:space="preserve">/</w:t>
-      </w:r>
-      <w:r>
-        <w:t xml:space="preserve"> </w:t>
-      </w:r>
-      <w:r>
-        <w:t xml:space="preserve">- Buscar</w:t>
-      </w:r>
-    </w:p>
-    <w:p>
-      <w:pPr>
-        <w:pStyle w:val="Compact"/>
-        <w:numPr>
-          <w:ilvl w:val="0"/>
-          <w:numId w:val="1021"/>
-        </w:numPr>
-      </w:pPr>
-      <w:r>
-        <w:rPr>
-          <w:rStyle w:val="VerbatimChar"/>
-        </w:rPr>
-        <w:t xml:space="preserve">zh</w:t>
-      </w:r>
-      <w:r>
-        <w:t xml:space="preserve"> </w:t>
-      </w:r>
-      <w:r>
-        <w:t xml:space="preserve">- Mostrar ocultos</w:t>
-      </w:r>
-    </w:p>
-    <w:p>
-      <w:pPr>
-        <w:pStyle w:val="Compact"/>
-        <w:numPr>
-          <w:ilvl w:val="0"/>
-          <w:numId w:val="1021"/>
-        </w:numPr>
-      </w:pPr>
-      <w:r>
-        <w:rPr>
-          <w:rStyle w:val="VerbatimChar"/>
-        </w:rPr>
-        <w:t xml:space="preserve">q</w:t>
-      </w:r>
-      <w:r>
-        <w:t xml:space="preserve"> </w:t>
-      </w:r>
-      <w:r>
-        <w:t xml:space="preserve">- Salir</w:t>
-      </w:r>
-    </w:p>
-    <w:bookmarkEnd w:id="148"/>
-    <w:bookmarkStart w:id="183" w:name="publicaciones-similares"/>
-    <w:p>
-      <w:pPr>
-        <w:pStyle w:val="Heading1"/>
-      </w:pPr>
-      <w:r>
-        <w:t xml:space="preserve">22. Publicaciones Similares</w:t>
-      </w:r>
-    </w:p>
-    <w:p>
-      <w:pPr>
-        <w:pStyle w:val="FirstParagraph"/>
-      </w:pPr>
-      <w:r>
-        <w:t xml:space="preserve">Si te interesó este artículo, te recomendamos que explores otros blogs y recursos relacionados que pueden ampliar tus conocimientos. Aquí te dejo algunas sugerencias:</w:t>
+          <w:b/>
+          <w:bCs/>
+        </w:rPr>
+        <w:t xml:space="preserve">Issues</w:t>
+      </w:r>
+      <w:r>
+        <w:t xml:space="preserve">: https://github.com/ranger/ranger/issues</w:t>
+      </w:r>
+    </w:p>
+    <w:bookmarkEnd w:id="145"/>
+    <w:bookmarkStart w:id="146" w:name="configuraciones-de-ejemplo"/>
+    <w:p>
+      <w:pPr>
+        <w:pStyle w:val="Heading2"/>
+      </w:pPr>
+      <w:r>
+        <w:t xml:space="preserve">20.4 Configuraciones de Ejemplo</w:t>
       </w:r>
     </w:p>
     <w:p>
@@ -21778,6 +21665,353 @@
         <w:numPr>
           <w:ilvl w:val="0"/>
           <w:numId w:val="1022"/>
+        </w:numPr>
+      </w:pPr>
+      <w:r>
+        <w:rPr>
+          <w:b/>
+          <w:bCs/>
+        </w:rPr>
+        <w:t xml:space="preserve">Dotfiles repos</w:t>
+      </w:r>
+      <w:r>
+        <w:t xml:space="preserve">: Buscar en GitHub</w:t>
+      </w:r>
+      <w:r>
+        <w:t xml:space="preserve"> </w:t>
+      </w:r>
+      <w:r>
+        <w:t xml:space="preserve">“ranger config”</w:t>
+      </w:r>
+    </w:p>
+    <w:p>
+      <w:pPr>
+        <w:pStyle w:val="Compact"/>
+        <w:numPr>
+          <w:ilvl w:val="0"/>
+          <w:numId w:val="1022"/>
+        </w:numPr>
+      </w:pPr>
+      <w:r>
+        <w:rPr>
+          <w:b/>
+          <w:bCs/>
+        </w:rPr>
+        <w:t xml:space="preserve">r/unixporn</w:t>
+      </w:r>
+      <w:r>
+        <w:t xml:space="preserve">: Muchas configuraciones compartidas</w:t>
+      </w:r>
+    </w:p>
+    <w:bookmarkEnd w:id="146"/>
+    <w:bookmarkEnd w:id="147"/>
+    <w:bookmarkStart w:id="148" w:name="conclusión"/>
+    <w:p>
+      <w:pPr>
+        <w:pStyle w:val="Heading1"/>
+      </w:pPr>
+      <w:r>
+        <w:t xml:space="preserve">21. Conclusión</w:t>
+      </w:r>
+    </w:p>
+    <w:p>
+      <w:pPr>
+        <w:pStyle w:val="FirstParagraph"/>
+      </w:pPr>
+      <w:r>
+        <w:t xml:space="preserve">Ranger es una herramienta poderosa que combina la eficiencia de los atajos de teclado estilo Vim con las capacidades modernas de previsualización y gestión de archivos.</w:t>
+      </w:r>
+    </w:p>
+    <w:p>
+      <w:pPr>
+        <w:pStyle w:val="BodyText"/>
+      </w:pPr>
+      <w:r>
+        <w:rPr>
+          <w:b/>
+          <w:bCs/>
+        </w:rPr>
+        <w:t xml:space="preserve">Consejos finales:</w:t>
+      </w:r>
+    </w:p>
+    <w:p>
+      <w:pPr>
+        <w:pStyle w:val="Compact"/>
+        <w:numPr>
+          <w:ilvl w:val="0"/>
+          <w:numId w:val="1023"/>
+        </w:numPr>
+      </w:pPr>
+      <w:r>
+        <w:rPr>
+          <w:b/>
+          <w:bCs/>
+        </w:rPr>
+        <w:t xml:space="preserve">Aprende gradualmente</w:t>
+      </w:r>
+      <w:r>
+        <w:t xml:space="preserve">: Comienza con los atajos básicos (hjkl, yy, dd, pp)</w:t>
+      </w:r>
+    </w:p>
+    <w:p>
+      <w:pPr>
+        <w:pStyle w:val="Compact"/>
+        <w:numPr>
+          <w:ilvl w:val="0"/>
+          <w:numId w:val="1023"/>
+        </w:numPr>
+      </w:pPr>
+      <w:r>
+        <w:rPr>
+          <w:b/>
+          <w:bCs/>
+        </w:rPr>
+        <w:t xml:space="preserve">Personaliza</w:t>
+      </w:r>
+      <w:r>
+        <w:t xml:space="preserve">: Ajusta rc.conf a tu flujo de trabajo</w:t>
+      </w:r>
+    </w:p>
+    <w:p>
+      <w:pPr>
+        <w:pStyle w:val="Compact"/>
+        <w:numPr>
+          <w:ilvl w:val="0"/>
+          <w:numId w:val="1023"/>
+        </w:numPr>
+      </w:pPr>
+      <w:r>
+        <w:rPr>
+          <w:b/>
+          <w:bCs/>
+        </w:rPr>
+        <w:t xml:space="preserve">Practica</w:t>
+      </w:r>
+      <w:r>
+        <w:t xml:space="preserve">: La memoria muscular viene con el uso</w:t>
+      </w:r>
+    </w:p>
+    <w:p>
+      <w:pPr>
+        <w:pStyle w:val="Compact"/>
+        <w:numPr>
+          <w:ilvl w:val="0"/>
+          <w:numId w:val="1023"/>
+        </w:numPr>
+      </w:pPr>
+      <w:r>
+        <w:rPr>
+          <w:b/>
+          <w:bCs/>
+        </w:rPr>
+        <w:t xml:space="preserve">Explora plugins</w:t>
+      </w:r>
+      <w:r>
+        <w:t xml:space="preserve">: Hay muchas extensiones útiles</w:t>
+      </w:r>
+    </w:p>
+    <w:p>
+      <w:pPr>
+        <w:pStyle w:val="Compact"/>
+        <w:numPr>
+          <w:ilvl w:val="0"/>
+          <w:numId w:val="1023"/>
+        </w:numPr>
+      </w:pPr>
+      <w:r>
+        <w:rPr>
+          <w:b/>
+          <w:bCs/>
+        </w:rPr>
+        <w:t xml:space="preserve">Lee el código</w:t>
+      </w:r>
+      <w:r>
+        <w:t xml:space="preserve">: Ranger es Python, fácil de extender</w:t>
+      </w:r>
+    </w:p>
+    <w:p>
+      <w:pPr>
+        <w:pStyle w:val="FirstParagraph"/>
+      </w:pPr>
+      <w:r>
+        <w:rPr>
+          <w:b/>
+          <w:bCs/>
+        </w:rPr>
+        <w:t xml:space="preserve">Atajos esenciales para memorizar:</w:t>
+      </w:r>
+    </w:p>
+    <w:p>
+      <w:pPr>
+        <w:pStyle w:val="Compact"/>
+        <w:numPr>
+          <w:ilvl w:val="0"/>
+          <w:numId w:val="1024"/>
+        </w:numPr>
+      </w:pPr>
+      <w:r>
+        <w:rPr>
+          <w:rStyle w:val="VerbatimChar"/>
+        </w:rPr>
+        <w:t xml:space="preserve">hjkl</w:t>
+      </w:r>
+      <w:r>
+        <w:t xml:space="preserve"> </w:t>
+      </w:r>
+      <w:r>
+        <w:t xml:space="preserve">- Navegación</w:t>
+      </w:r>
+    </w:p>
+    <w:p>
+      <w:pPr>
+        <w:pStyle w:val="Compact"/>
+        <w:numPr>
+          <w:ilvl w:val="0"/>
+          <w:numId w:val="1024"/>
+        </w:numPr>
+      </w:pPr>
+      <w:r>
+        <w:rPr>
+          <w:rStyle w:val="VerbatimChar"/>
+        </w:rPr>
+        <w:t xml:space="preserve">yy/dd/pp</w:t>
+      </w:r>
+      <w:r>
+        <w:t xml:space="preserve"> </w:t>
+      </w:r>
+      <w:r>
+        <w:t xml:space="preserve">- Copiar/cortar/pegar</w:t>
+      </w:r>
+    </w:p>
+    <w:p>
+      <w:pPr>
+        <w:pStyle w:val="Compact"/>
+        <w:numPr>
+          <w:ilvl w:val="0"/>
+          <w:numId w:val="1024"/>
+        </w:numPr>
+      </w:pPr>
+      <w:r>
+        <w:rPr>
+          <w:rStyle w:val="VerbatimChar"/>
+        </w:rPr>
+        <w:t xml:space="preserve">Space</w:t>
+      </w:r>
+      <w:r>
+        <w:t xml:space="preserve"> </w:t>
+      </w:r>
+      <w:r>
+        <w:t xml:space="preserve">- Seleccionar</w:t>
+      </w:r>
+    </w:p>
+    <w:p>
+      <w:pPr>
+        <w:pStyle w:val="Compact"/>
+        <w:numPr>
+          <w:ilvl w:val="0"/>
+          <w:numId w:val="1024"/>
+        </w:numPr>
+      </w:pPr>
+      <w:r>
+        <w:rPr>
+          <w:rStyle w:val="VerbatimChar"/>
+        </w:rPr>
+        <w:t xml:space="preserve">gg/G</w:t>
+      </w:r>
+      <w:r>
+        <w:t xml:space="preserve"> </w:t>
+      </w:r>
+      <w:r>
+        <w:t xml:space="preserve">- Inicio/fin</w:t>
+      </w:r>
+    </w:p>
+    <w:p>
+      <w:pPr>
+        <w:pStyle w:val="Compact"/>
+        <w:numPr>
+          <w:ilvl w:val="0"/>
+          <w:numId w:val="1024"/>
+        </w:numPr>
+      </w:pPr>
+      <w:r>
+        <w:rPr>
+          <w:rStyle w:val="VerbatimChar"/>
+        </w:rPr>
+        <w:t xml:space="preserve">/</w:t>
+      </w:r>
+      <w:r>
+        <w:t xml:space="preserve"> </w:t>
+      </w:r>
+      <w:r>
+        <w:t xml:space="preserve">- Buscar</w:t>
+      </w:r>
+    </w:p>
+    <w:p>
+      <w:pPr>
+        <w:pStyle w:val="Compact"/>
+        <w:numPr>
+          <w:ilvl w:val="0"/>
+          <w:numId w:val="1024"/>
+        </w:numPr>
+      </w:pPr>
+      <w:r>
+        <w:rPr>
+          <w:rStyle w:val="VerbatimChar"/>
+        </w:rPr>
+        <w:t xml:space="preserve">zh</w:t>
+      </w:r>
+      <w:r>
+        <w:t xml:space="preserve"> </w:t>
+      </w:r>
+      <w:r>
+        <w:t xml:space="preserve">- Mostrar ocultos</w:t>
+      </w:r>
+    </w:p>
+    <w:p>
+      <w:pPr>
+        <w:pStyle w:val="Compact"/>
+        <w:numPr>
+          <w:ilvl w:val="0"/>
+          <w:numId w:val="1024"/>
+        </w:numPr>
+      </w:pPr>
+      <w:r>
+        <w:rPr>
+          <w:rStyle w:val="VerbatimChar"/>
+        </w:rPr>
+        <w:t xml:space="preserve">q</w:t>
+      </w:r>
+      <w:r>
+        <w:t xml:space="preserve"> </w:t>
+      </w:r>
+      <w:r>
+        <w:t xml:space="preserve">- Salir</w:t>
+      </w:r>
+    </w:p>
+    <w:bookmarkEnd w:id="148"/>
+    <w:bookmarkStart w:id="183" w:name="publicaciones-similares"/>
+    <w:p>
+      <w:pPr>
+        <w:pStyle w:val="Heading1"/>
+      </w:pPr>
+      <w:r>
+        <w:t xml:space="preserve">22. Publicaciones Similares</w:t>
+      </w:r>
+    </w:p>
+    <w:p>
+      <w:pPr>
+        <w:pStyle w:val="FirstParagraph"/>
+      </w:pPr>
+      <w:r>
+        <w:t xml:space="preserve">Si te interesó este artículo, te recomendamos que explores otros blogs y recursos relacionados que pueden ampliar tus conocimientos. Aquí te dejo algunas sugerencias:</w:t>
+      </w:r>
+    </w:p>
+    <w:p>
+      <w:pPr>
+        <w:pStyle w:val="Compact"/>
+        <w:numPr>
+          <w:ilvl w:val="0"/>
+          <w:numId w:val="1025"/>
         </w:numPr>
       </w:pPr>
       <w:hyperlink r:id="rId149"/>
@@ -21798,7 +22032,7 @@
         <w:pStyle w:val="Compact"/>
         <w:numPr>
           <w:ilvl w:val="0"/>
-          <w:numId w:val="1022"/>
+          <w:numId w:val="1025"/>
         </w:numPr>
       </w:pPr>
       <w:hyperlink r:id="rId151"/>
@@ -21819,7 +22053,7 @@
         <w:pStyle w:val="Compact"/>
         <w:numPr>
           <w:ilvl w:val="0"/>
-          <w:numId w:val="1022"/>
+          <w:numId w:val="1025"/>
         </w:numPr>
       </w:pPr>
       <w:hyperlink r:id="rId153"/>
@@ -21840,7 +22074,7 @@
         <w:pStyle w:val="Compact"/>
         <w:numPr>
           <w:ilvl w:val="0"/>
-          <w:numId w:val="1022"/>
+          <w:numId w:val="1025"/>
         </w:numPr>
       </w:pPr>
       <w:hyperlink r:id="rId155"/>
@@ -21861,7 +22095,7 @@
         <w:pStyle w:val="Compact"/>
         <w:numPr>
           <w:ilvl w:val="0"/>
-          <w:numId w:val="1022"/>
+          <w:numId w:val="1025"/>
         </w:numPr>
       </w:pPr>
       <w:hyperlink r:id="rId157"/>
@@ -21882,7 +22116,7 @@
         <w:pStyle w:val="Compact"/>
         <w:numPr>
           <w:ilvl w:val="0"/>
-          <w:numId w:val="1022"/>
+          <w:numId w:val="1025"/>
         </w:numPr>
       </w:pPr>
       <w:hyperlink r:id="rId159"/>
@@ -21903,7 +22137,7 @@
         <w:pStyle w:val="Compact"/>
         <w:numPr>
           <w:ilvl w:val="0"/>
-          <w:numId w:val="1022"/>
+          <w:numId w:val="1025"/>
         </w:numPr>
       </w:pPr>
       <w:hyperlink r:id="rId161"/>
@@ -21924,7 +22158,7 @@
         <w:pStyle w:val="Compact"/>
         <w:numPr>
           <w:ilvl w:val="0"/>
-          <w:numId w:val="1022"/>
+          <w:numId w:val="1025"/>
         </w:numPr>
       </w:pPr>
       <w:hyperlink r:id="rId163"/>
@@ -21945,7 +22179,7 @@
         <w:pStyle w:val="Compact"/>
         <w:numPr>
           <w:ilvl w:val="0"/>
-          <w:numId w:val="1022"/>
+          <w:numId w:val="1025"/>
         </w:numPr>
       </w:pPr>
       <w:hyperlink r:id="rId165"/>
@@ -21966,7 +22200,7 @@
         <w:pStyle w:val="Compact"/>
         <w:numPr>
           <w:ilvl w:val="0"/>
-          <w:numId w:val="1022"/>
+          <w:numId w:val="1025"/>
         </w:numPr>
       </w:pPr>
       <w:hyperlink r:id="rId167"/>
@@ -21987,7 +22221,7 @@
         <w:pStyle w:val="Compact"/>
         <w:numPr>
           <w:ilvl w:val="0"/>
-          <w:numId w:val="1022"/>
+          <w:numId w:val="1025"/>
         </w:numPr>
       </w:pPr>
       <w:hyperlink r:id="rId169"/>
@@ -22008,7 +22242,7 @@
         <w:pStyle w:val="Compact"/>
         <w:numPr>
           <w:ilvl w:val="0"/>
-          <w:numId w:val="1022"/>
+          <w:numId w:val="1025"/>
         </w:numPr>
       </w:pPr>
       <w:hyperlink r:id="rId171"/>
@@ -22029,7 +22263,7 @@
         <w:pStyle w:val="Compact"/>
         <w:numPr>
           <w:ilvl w:val="0"/>
-          <w:numId w:val="1022"/>
+          <w:numId w:val="1025"/>
         </w:numPr>
       </w:pPr>
       <w:hyperlink r:id="rId173"/>
@@ -22050,7 +22284,7 @@
         <w:pStyle w:val="Compact"/>
         <w:numPr>
           <w:ilvl w:val="0"/>
-          <w:numId w:val="1022"/>
+          <w:numId w:val="1025"/>
         </w:numPr>
       </w:pPr>
       <w:hyperlink r:id="rId175"/>
@@ -22071,7 +22305,7 @@
         <w:pStyle w:val="Compact"/>
         <w:numPr>
           <w:ilvl w:val="0"/>
-          <w:numId w:val="1022"/>
+          <w:numId w:val="1025"/>
         </w:numPr>
       </w:pPr>
       <w:hyperlink r:id="rId177"/>
@@ -22092,7 +22326,7 @@
         <w:pStyle w:val="Compact"/>
         <w:numPr>
           <w:ilvl w:val="0"/>
-          <w:numId w:val="1022"/>
+          <w:numId w:val="1025"/>
         </w:numPr>
       </w:pPr>
       <w:hyperlink r:id="rId179"/>
@@ -22113,7 +22347,7 @@
         <w:pStyle w:val="Compact"/>
         <w:numPr>
           <w:ilvl w:val="0"/>
-          <w:numId w:val="1022"/>
+          <w:numId w:val="1025"/>
         </w:numPr>
       </w:pPr>
       <w:hyperlink r:id="rId181"/>
@@ -22905,6 +23139,9 @@
     <w:abstractNumId w:val="991"/>
   </w:num>
   <w:num w:numId="1004">
+    <w:abstractNumId w:val="991"/>
+  </w:num>
+  <w:num w:numId="1005">
     <w:abstractNumId w:val="99411"/>
     <w:lvlOverride w:ilvl="0">
       <w:startOverride w:val="1"/>
@@ -22933,9 +23170,6 @@
     <w:lvlOverride w:ilvl="8">
       <w:startOverride w:val="1"/>
     </w:lvlOverride>
-  </w:num>
-  <w:num w:numId="1005">
-    <w:abstractNumId w:val="991"/>
   </w:num>
   <w:num w:numId="1006">
     <w:abstractNumId w:val="991"/>
@@ -22974,12 +23208,6 @@
     <w:abstractNumId w:val="991"/>
   </w:num>
   <w:num w:numId="1018">
-    <w:abstractNumId w:val="991"/>
-  </w:num>
-  <w:num w:numId="1019">
-    <w:abstractNumId w:val="991"/>
-  </w:num>
-  <w:num w:numId="1020">
     <w:abstractNumId w:val="99411"/>
     <w:lvlOverride w:ilvl="0">
       <w:startOverride w:val="1"/>
@@ -23009,10 +23237,52 @@
       <w:startOverride w:val="1"/>
     </w:lvlOverride>
   </w:num>
+  <w:num w:numId="1019">
+    <w:abstractNumId w:val="991"/>
+  </w:num>
+  <w:num w:numId="1020">
+    <w:abstractNumId w:val="991"/>
+  </w:num>
   <w:num w:numId="1021">
     <w:abstractNumId w:val="991"/>
   </w:num>
   <w:num w:numId="1022">
+    <w:abstractNumId w:val="991"/>
+  </w:num>
+  <w:num w:numId="1023">
+    <w:abstractNumId w:val="99411"/>
+    <w:lvlOverride w:ilvl="0">
+      <w:startOverride w:val="1"/>
+    </w:lvlOverride>
+    <w:lvlOverride w:ilvl="1">
+      <w:startOverride w:val="1"/>
+    </w:lvlOverride>
+    <w:lvlOverride w:ilvl="2">
+      <w:startOverride w:val="1"/>
+    </w:lvlOverride>
+    <w:lvlOverride w:ilvl="3">
+      <w:startOverride w:val="1"/>
+    </w:lvlOverride>
+    <w:lvlOverride w:ilvl="4">
+      <w:startOverride w:val="1"/>
+    </w:lvlOverride>
+    <w:lvlOverride w:ilvl="5">
+      <w:startOverride w:val="1"/>
+    </w:lvlOverride>
+    <w:lvlOverride w:ilvl="6">
+      <w:startOverride w:val="1"/>
+    </w:lvlOverride>
+    <w:lvlOverride w:ilvl="7">
+      <w:startOverride w:val="1"/>
+    </w:lvlOverride>
+    <w:lvlOverride w:ilvl="8">
+      <w:startOverride w:val="1"/>
+    </w:lvlOverride>
+  </w:num>
+  <w:num w:numId="1024">
+    <w:abstractNumId w:val="991"/>
+  </w:num>
+  <w:num w:numId="1025">
     <w:abstractNumId w:val="99411"/>
     <w:lvlOverride w:ilvl="0">
       <w:startOverride w:val="1"/>

</xml_diff>